<commit_message>
Pengumpulan hasil Pilot dari dua coder dan rencana Pilot CC (lanjutan)
</commit_message>
<xml_diff>
--- a/P4 Pengembangan Kebutuhan Perangkat Lunak/A Elisitasi/A4 Coding/[2] Codebook_1_0_3.docx
+++ b/P4 Pengembangan Kebutuhan Perangkat Lunak/A Elisitasi/A4 Coding/[2] Codebook_1_0_3.docx
@@ -240,9 +240,10 @@
         <w:tblLook w:val="04A0" w:firstRow="1" w:lastRow="0" w:firstColumn="1" w:lastColumn="0" w:noHBand="0" w:noVBand="1"/>
       </w:tblPr>
       <w:tblGrid>
-        <w:gridCol w:w="2955"/>
-        <w:gridCol w:w="5032"/>
-        <w:gridCol w:w="1371"/>
+        <w:gridCol w:w="369"/>
+        <w:gridCol w:w="3260"/>
+        <w:gridCol w:w="4252"/>
+        <w:gridCol w:w="1477"/>
       </w:tblGrid>
       <w:tr>
         <w:trPr>
@@ -250,38 +251,35 @@
         </w:trPr>
         <w:tc>
           <w:tcPr>
-            <w:shd w:val="clear" w:color="auto" w:fill="f2f2f2"/>
+            <w:shd w:val="clear" w:color="ffffff" w:fill="f2f2f2"/>
             <w:tcBorders>
               <w:top w:val="single" w:color="000000" w:sz="4" w:space="0"/>
               <w:left w:val="single" w:color="000000" w:sz="4" w:space="0"/>
               <w:bottom w:val="single" w:color="000000" w:sz="4" w:space="0"/>
               <w:right w:val="single" w:color="000000" w:sz="4" w:space="0"/>
             </w:tcBorders>
-            <w:tcW w:w="2955" w:type="dxa"/>
+            <w:tcW w:w="369" w:type="dxa"/>
           </w:tcPr>
           <w:p>
             <w:pPr>
-              <w:pStyle w:val="989"/>
-              <w:spacing w:after="160" w:before="0"/>
+              <w:spacing/>
               <w:ind/>
               <w:rPr>
                 <w:sz w:val="22"/>
+                <w:szCs w:val="22"/>
               </w:rPr>
             </w:pPr>
             <w:r>
               <w:rPr>
                 <w:sz w:val="22"/>
-              </w:rPr>
-              <w:t xml:space="preserve">Nilai kolom "Dokumen"</w:t>
-            </w:r>
-            <w:r>
-              <w:rPr>
-                <w:sz w:val="22"/>
-              </w:rPr>
-            </w:r>
-            <w:r>
-              <w:rPr>
-                <w:sz w:val="22"/>
+                <w:szCs w:val="22"/>
+              </w:rPr>
+              <w:t xml:space="preserve">#</w:t>
+            </w:r>
+            <w:r>
+              <w:rPr>
+                <w:sz w:val="22"/>
+                <w:szCs w:val="22"/>
               </w:rPr>
             </w:r>
           </w:p>
@@ -295,7 +293,7 @@
               <w:bottom w:val="single" w:color="000000" w:sz="4" w:space="0"/>
               <w:right w:val="single" w:color="000000" w:sz="4" w:space="0"/>
             </w:tcBorders>
-            <w:tcW w:w="5032" w:type="dxa"/>
+            <w:tcW w:w="3260" w:type="dxa"/>
           </w:tcPr>
           <w:p>
             <w:pPr>
@@ -310,7 +308,7 @@
               <w:rPr>
                 <w:sz w:val="22"/>
               </w:rPr>
-              <w:t xml:space="preserve">Sumber</w:t>
+              <w:t xml:space="preserve">Nilai kolom "Dokumen"</w:t>
             </w:r>
             <w:r>
               <w:rPr>
@@ -333,7 +331,45 @@
               <w:bottom w:val="single" w:color="000000" w:sz="4" w:space="0"/>
               <w:right w:val="single" w:color="000000" w:sz="4" w:space="0"/>
             </w:tcBorders>
-            <w:tcW w:w="1371" w:type="dxa"/>
+            <w:tcW w:w="4252" w:type="dxa"/>
+          </w:tcPr>
+          <w:p>
+            <w:pPr>
+              <w:pStyle w:val="989"/>
+              <w:spacing w:after="160" w:before="0"/>
+              <w:ind/>
+              <w:rPr>
+                <w:sz w:val="22"/>
+              </w:rPr>
+            </w:pPr>
+            <w:r>
+              <w:rPr>
+                <w:sz w:val="22"/>
+              </w:rPr>
+              <w:t xml:space="preserve">Sumber</w:t>
+            </w:r>
+            <w:r>
+              <w:rPr>
+                <w:sz w:val="22"/>
+              </w:rPr>
+            </w:r>
+            <w:r>
+              <w:rPr>
+                <w:sz w:val="22"/>
+              </w:rPr>
+            </w:r>
+          </w:p>
+        </w:tc>
+        <w:tc>
+          <w:tcPr>
+            <w:shd w:val="clear" w:color="auto" w:fill="f2f2f2"/>
+            <w:tcBorders>
+              <w:top w:val="single" w:color="000000" w:sz="4" w:space="0"/>
+              <w:left w:val="single" w:color="000000" w:sz="4" w:space="0"/>
+              <w:bottom w:val="single" w:color="000000" w:sz="4" w:space="0"/>
+              <w:right w:val="single" w:color="000000" w:sz="4" w:space="0"/>
+            </w:tcBorders>
+            <w:tcW w:w="1477" w:type="dxa"/>
           </w:tcPr>
           <w:p>
             <w:pPr>
@@ -373,31 +409,28 @@
               <w:bottom w:val="single" w:color="000000" w:sz="4" w:space="0"/>
               <w:right w:val="single" w:color="000000" w:sz="4" w:space="0"/>
             </w:tcBorders>
-            <w:tcW w:w="2955" w:type="dxa"/>
+            <w:tcW w:w="369" w:type="dxa"/>
           </w:tcPr>
           <w:p>
             <w:pPr>
-              <w:pStyle w:val="989"/>
-              <w:spacing w:after="160" w:before="0"/>
+              <w:spacing/>
               <w:ind/>
               <w:rPr>
                 <w:sz w:val="22"/>
+                <w:szCs w:val="22"/>
               </w:rPr>
             </w:pPr>
             <w:r>
               <w:rPr>
                 <w:sz w:val="22"/>
-              </w:rPr>
-              <w:t xml:space="preserve">2019MHN201</w:t>
-            </w:r>
-            <w:r>
-              <w:rPr>
-                <w:sz w:val="22"/>
-              </w:rPr>
-            </w:r>
-            <w:r>
-              <w:rPr>
-                <w:sz w:val="22"/>
+                <w:szCs w:val="22"/>
+              </w:rPr>
+              <w:t xml:space="preserve">1</w:t>
+            </w:r>
+            <w:r>
+              <w:rPr>
+                <w:sz w:val="22"/>
+                <w:szCs w:val="22"/>
               </w:rPr>
             </w:r>
           </w:p>
@@ -410,7 +443,7 @@
               <w:bottom w:val="single" w:color="000000" w:sz="4" w:space="0"/>
               <w:right w:val="single" w:color="000000" w:sz="4" w:space="0"/>
             </w:tcBorders>
-            <w:tcW w:w="5032" w:type="dxa"/>
+            <w:tcW w:w="3260" w:type="dxa"/>
           </w:tcPr>
           <w:p>
             <w:pPr>
@@ -425,7 +458,7 @@
               <w:rPr>
                 <w:sz w:val="22"/>
               </w:rPr>
-              <w:t xml:space="preserve">Artikel Majalah Hukum Nasional (kode 2019MHN201)</w:t>
+              <w:t xml:space="preserve">2019MHN201</w:t>
             </w:r>
             <w:r>
               <w:rPr>
@@ -447,7 +480,44 @@
               <w:bottom w:val="single" w:color="000000" w:sz="4" w:space="0"/>
               <w:right w:val="single" w:color="000000" w:sz="4" w:space="0"/>
             </w:tcBorders>
-            <w:tcW w:w="1371" w:type="dxa"/>
+            <w:tcW w:w="4252" w:type="dxa"/>
+          </w:tcPr>
+          <w:p>
+            <w:pPr>
+              <w:pStyle w:val="989"/>
+              <w:spacing w:after="160" w:before="0"/>
+              <w:ind/>
+              <w:rPr>
+                <w:sz w:val="22"/>
+              </w:rPr>
+            </w:pPr>
+            <w:r>
+              <w:rPr>
+                <w:sz w:val="22"/>
+              </w:rPr>
+              <w:t xml:space="preserve">Artikel Majalah Hukum Nasional (kode 2019MHN201)</w:t>
+            </w:r>
+            <w:r>
+              <w:rPr>
+                <w:sz w:val="22"/>
+              </w:rPr>
+            </w:r>
+            <w:r>
+              <w:rPr>
+                <w:sz w:val="22"/>
+              </w:rPr>
+            </w:r>
+          </w:p>
+        </w:tc>
+        <w:tc>
+          <w:tcPr>
+            <w:tcBorders>
+              <w:top w:val="single" w:color="000000" w:sz="4" w:space="0"/>
+              <w:left w:val="single" w:color="000000" w:sz="4" w:space="0"/>
+              <w:bottom w:val="single" w:color="000000" w:sz="4" w:space="0"/>
+              <w:right w:val="single" w:color="000000" w:sz="4" w:space="0"/>
+            </w:tcBorders>
+            <w:tcW w:w="1477" w:type="dxa"/>
           </w:tcPr>
           <w:p>
             <w:pPr>
@@ -486,31 +556,28 @@
               <w:bottom w:val="single" w:color="000000" w:sz="4" w:space="0"/>
               <w:right w:val="single" w:color="000000" w:sz="4" w:space="0"/>
             </w:tcBorders>
-            <w:tcW w:w="2955" w:type="dxa"/>
+            <w:tcW w:w="369" w:type="dxa"/>
           </w:tcPr>
           <w:p>
             <w:pPr>
-              <w:pStyle w:val="989"/>
-              <w:spacing w:after="160" w:before="0"/>
+              <w:spacing/>
               <w:ind/>
               <w:rPr>
                 <w:sz w:val="22"/>
+                <w:szCs w:val="22"/>
               </w:rPr>
             </w:pPr>
             <w:r>
               <w:rPr>
                 <w:sz w:val="22"/>
-              </w:rPr>
-              <w:t xml:space="preserve">UU 27 Thn 2022 (PDP)</w:t>
-            </w:r>
-            <w:r>
-              <w:rPr>
-                <w:sz w:val="22"/>
-              </w:rPr>
-            </w:r>
-            <w:r>
-              <w:rPr>
-                <w:sz w:val="22"/>
+                <w:szCs w:val="22"/>
+              </w:rPr>
+              <w:t xml:space="preserve">2</w:t>
+            </w:r>
+            <w:r>
+              <w:rPr>
+                <w:sz w:val="22"/>
+                <w:szCs w:val="22"/>
               </w:rPr>
             </w:r>
           </w:p>
@@ -522,7 +589,7 @@
               <w:bottom w:val="single" w:color="000000" w:sz="4" w:space="0"/>
               <w:right w:val="single" w:color="000000" w:sz="4" w:space="0"/>
             </w:tcBorders>
-            <w:tcW w:w="5032" w:type="dxa"/>
+            <w:tcW w:w="3260" w:type="dxa"/>
           </w:tcPr>
           <w:p>
             <w:pPr>
@@ -537,7 +604,7 @@
               <w:rPr>
                 <w:sz w:val="22"/>
               </w:rPr>
-              <w:t xml:space="preserve">UU No. 27 Tahun 2022 tentang Pelindungan Data Pribadi</w:t>
+              <w:t xml:space="preserve">UU 27 Thn 2022 (PDP)</w:t>
             </w:r>
             <w:r>
               <w:rPr>
@@ -558,7 +625,43 @@
               <w:bottom w:val="single" w:color="000000" w:sz="4" w:space="0"/>
               <w:right w:val="single" w:color="000000" w:sz="4" w:space="0"/>
             </w:tcBorders>
-            <w:tcW w:w="1371" w:type="dxa"/>
+            <w:tcW w:w="4252" w:type="dxa"/>
+          </w:tcPr>
+          <w:p>
+            <w:pPr>
+              <w:pStyle w:val="989"/>
+              <w:spacing w:after="160" w:before="0"/>
+              <w:ind/>
+              <w:rPr>
+                <w:sz w:val="22"/>
+              </w:rPr>
+            </w:pPr>
+            <w:r>
+              <w:rPr>
+                <w:sz w:val="22"/>
+              </w:rPr>
+              <w:t xml:space="preserve">UU No. 27 Tahun 2022 tentang Pelindungan Data Pribadi</w:t>
+            </w:r>
+            <w:r>
+              <w:rPr>
+                <w:sz w:val="22"/>
+              </w:rPr>
+            </w:r>
+            <w:r>
+              <w:rPr>
+                <w:sz w:val="22"/>
+              </w:rPr>
+            </w:r>
+          </w:p>
+        </w:tc>
+        <w:tc>
+          <w:tcPr>
+            <w:tcBorders>
+              <w:left w:val="single" w:color="000000" w:sz="4" w:space="0"/>
+              <w:bottom w:val="single" w:color="000000" w:sz="4" w:space="0"/>
+              <w:right w:val="single" w:color="000000" w:sz="4" w:space="0"/>
+            </w:tcBorders>
+            <w:tcW w:w="1477" w:type="dxa"/>
           </w:tcPr>
           <w:p>
             <w:pPr>
@@ -598,31 +701,28 @@
               <w:bottom w:val="single" w:color="000000" w:sz="4" w:space="0"/>
               <w:right w:val="single" w:color="000000" w:sz="4" w:space="0"/>
             </w:tcBorders>
-            <w:tcW w:w="2955" w:type="dxa"/>
+            <w:tcW w:w="369" w:type="dxa"/>
           </w:tcPr>
           <w:p>
             <w:pPr>
-              <w:pStyle w:val="989"/>
-              <w:spacing w:after="160" w:before="0"/>
+              <w:spacing/>
               <w:ind/>
               <w:rPr>
                 <w:sz w:val="22"/>
+                <w:szCs w:val="22"/>
               </w:rPr>
             </w:pPr>
             <w:r>
               <w:rPr>
                 <w:sz w:val="22"/>
-              </w:rPr>
-              <w:t xml:space="preserve">Perpres 39 Thn 2019 (Satu Data)</w:t>
-            </w:r>
-            <w:r>
-              <w:rPr>
-                <w:sz w:val="22"/>
-              </w:rPr>
-            </w:r>
-            <w:r>
-              <w:rPr>
-                <w:sz w:val="22"/>
+                <w:szCs w:val="22"/>
+              </w:rPr>
+              <w:t xml:space="preserve">3</w:t>
+            </w:r>
+            <w:r>
+              <w:rPr>
+                <w:sz w:val="22"/>
+                <w:szCs w:val="22"/>
               </w:rPr>
             </w:r>
           </w:p>
@@ -635,7 +735,7 @@
               <w:bottom w:val="single" w:color="000000" w:sz="4" w:space="0"/>
               <w:right w:val="single" w:color="000000" w:sz="4" w:space="0"/>
             </w:tcBorders>
-            <w:tcW w:w="5032" w:type="dxa"/>
+            <w:tcW w:w="3260" w:type="dxa"/>
           </w:tcPr>
           <w:p>
             <w:pPr>
@@ -650,7 +750,7 @@
               <w:rPr>
                 <w:sz w:val="22"/>
               </w:rPr>
-              <w:t xml:space="preserve">Perpres No. 39 Tahun 2019 tentang Satu Data Indonesia</w:t>
+              <w:t xml:space="preserve">Perpres 39 Thn 2019 (Satu Data)</w:t>
             </w:r>
             <w:r>
               <w:rPr>
@@ -672,7 +772,44 @@
               <w:bottom w:val="single" w:color="000000" w:sz="4" w:space="0"/>
               <w:right w:val="single" w:color="000000" w:sz="4" w:space="0"/>
             </w:tcBorders>
-            <w:tcW w:w="1371" w:type="dxa"/>
+            <w:tcW w:w="4252" w:type="dxa"/>
+          </w:tcPr>
+          <w:p>
+            <w:pPr>
+              <w:pStyle w:val="989"/>
+              <w:spacing w:after="160" w:before="0"/>
+              <w:ind/>
+              <w:rPr>
+                <w:sz w:val="22"/>
+              </w:rPr>
+            </w:pPr>
+            <w:r>
+              <w:rPr>
+                <w:sz w:val="22"/>
+              </w:rPr>
+              <w:t xml:space="preserve">Perpres No. 39 Tahun 2019 tentang Satu Data Indonesia</w:t>
+            </w:r>
+            <w:r>
+              <w:rPr>
+                <w:sz w:val="22"/>
+              </w:rPr>
+            </w:r>
+            <w:r>
+              <w:rPr>
+                <w:sz w:val="22"/>
+              </w:rPr>
+            </w:r>
+          </w:p>
+        </w:tc>
+        <w:tc>
+          <w:tcPr>
+            <w:tcBorders>
+              <w:top w:val="single" w:color="000000" w:sz="4" w:space="0"/>
+              <w:left w:val="single" w:color="000000" w:sz="4" w:space="0"/>
+              <w:bottom w:val="single" w:color="000000" w:sz="4" w:space="0"/>
+              <w:right w:val="single" w:color="000000" w:sz="4" w:space="0"/>
+            </w:tcBorders>
+            <w:tcW w:w="1477" w:type="dxa"/>
           </w:tcPr>
           <w:p>
             <w:pPr>
@@ -712,31 +849,28 @@
               <w:bottom w:val="single" w:color="000000" w:sz="4" w:space="0"/>
               <w:right w:val="single" w:color="000000" w:sz="4" w:space="0"/>
             </w:tcBorders>
-            <w:tcW w:w="2955" w:type="dxa"/>
+            <w:tcW w:w="369" w:type="dxa"/>
           </w:tcPr>
           <w:p>
             <w:pPr>
-              <w:pStyle w:val="989"/>
-              <w:spacing w:after="160" w:before="0"/>
+              <w:spacing/>
               <w:ind/>
               <w:rPr>
                 <w:sz w:val="22"/>
+                <w:szCs w:val="22"/>
               </w:rPr>
             </w:pPr>
             <w:r>
               <w:rPr>
                 <w:sz w:val="22"/>
-              </w:rPr>
-              <w:t xml:space="preserve">UU 23 Thn 2002 (Perlindungan Anak)</w:t>
-            </w:r>
-            <w:r>
-              <w:rPr>
-                <w:sz w:val="22"/>
-              </w:rPr>
-            </w:r>
-            <w:r>
-              <w:rPr>
-                <w:sz w:val="22"/>
+                <w:szCs w:val="22"/>
+              </w:rPr>
+              <w:t xml:space="preserve">4</w:t>
+            </w:r>
+            <w:r>
+              <w:rPr>
+                <w:sz w:val="22"/>
+                <w:szCs w:val="22"/>
               </w:rPr>
             </w:r>
           </w:p>
@@ -749,7 +883,7 @@
               <w:bottom w:val="single" w:color="000000" w:sz="4" w:space="0"/>
               <w:right w:val="single" w:color="000000" w:sz="4" w:space="0"/>
             </w:tcBorders>
-            <w:tcW w:w="5032" w:type="dxa"/>
+            <w:tcW w:w="3260" w:type="dxa"/>
           </w:tcPr>
           <w:p>
             <w:pPr>
@@ -764,7 +898,7 @@
               <w:rPr>
                 <w:sz w:val="22"/>
               </w:rPr>
-              <w:t xml:space="preserve">UU No. 23 Tahun 2002 tentang Perlindungan Anak</w:t>
+              <w:t xml:space="preserve">UU 23 Thn 2002 (Perlindungan Anak)</w:t>
             </w:r>
             <w:r>
               <w:rPr>
@@ -786,7 +920,44 @@
               <w:bottom w:val="single" w:color="000000" w:sz="4" w:space="0"/>
               <w:right w:val="single" w:color="000000" w:sz="4" w:space="0"/>
             </w:tcBorders>
-            <w:tcW w:w="1371" w:type="dxa"/>
+            <w:tcW w:w="4252" w:type="dxa"/>
+          </w:tcPr>
+          <w:p>
+            <w:pPr>
+              <w:pStyle w:val="989"/>
+              <w:spacing w:after="160" w:before="0"/>
+              <w:ind/>
+              <w:rPr>
+                <w:sz w:val="22"/>
+              </w:rPr>
+            </w:pPr>
+            <w:r>
+              <w:rPr>
+                <w:sz w:val="22"/>
+              </w:rPr>
+              <w:t xml:space="preserve">UU No. 23 Tahun 2002 tentang Perlindungan Anak</w:t>
+            </w:r>
+            <w:r>
+              <w:rPr>
+                <w:sz w:val="22"/>
+              </w:rPr>
+            </w:r>
+            <w:r>
+              <w:rPr>
+                <w:sz w:val="22"/>
+              </w:rPr>
+            </w:r>
+          </w:p>
+        </w:tc>
+        <w:tc>
+          <w:tcPr>
+            <w:tcBorders>
+              <w:top w:val="single" w:color="000000" w:sz="4" w:space="0"/>
+              <w:left w:val="single" w:color="000000" w:sz="4" w:space="0"/>
+              <w:bottom w:val="single" w:color="000000" w:sz="4" w:space="0"/>
+              <w:right w:val="single" w:color="000000" w:sz="4" w:space="0"/>
+            </w:tcBorders>
+            <w:tcW w:w="1477" w:type="dxa"/>
           </w:tcPr>
           <w:p>
             <w:pPr>
@@ -826,31 +997,28 @@
               <w:bottom w:val="single" w:color="000000" w:sz="4" w:space="0"/>
               <w:right w:val="single" w:color="000000" w:sz="4" w:space="0"/>
             </w:tcBorders>
-            <w:tcW w:w="2955" w:type="dxa"/>
+            <w:tcW w:w="369" w:type="dxa"/>
           </w:tcPr>
           <w:p>
             <w:pPr>
-              <w:pStyle w:val="989"/>
-              <w:spacing w:after="160" w:before="0"/>
+              <w:spacing/>
               <w:ind/>
               <w:rPr>
                 <w:sz w:val="22"/>
+                <w:szCs w:val="22"/>
               </w:rPr>
             </w:pPr>
             <w:r>
               <w:rPr>
                 <w:sz w:val="22"/>
-              </w:rPr>
-              <w:t xml:space="preserve">UU 8 Thn 1999 (Perlindungan Konsumen)</w:t>
-            </w:r>
-            <w:r>
-              <w:rPr>
-                <w:sz w:val="22"/>
-              </w:rPr>
-            </w:r>
-            <w:r>
-              <w:rPr>
-                <w:sz w:val="22"/>
+                <w:szCs w:val="22"/>
+              </w:rPr>
+              <w:t xml:space="preserve">5</w:t>
+            </w:r>
+            <w:r>
+              <w:rPr>
+                <w:sz w:val="22"/>
+                <w:szCs w:val="22"/>
               </w:rPr>
             </w:r>
           </w:p>
@@ -863,7 +1031,7 @@
               <w:bottom w:val="single" w:color="000000" w:sz="4" w:space="0"/>
               <w:right w:val="single" w:color="000000" w:sz="4" w:space="0"/>
             </w:tcBorders>
-            <w:tcW w:w="5032" w:type="dxa"/>
+            <w:tcW w:w="3260" w:type="dxa"/>
           </w:tcPr>
           <w:p>
             <w:pPr>
@@ -878,7 +1046,7 @@
               <w:rPr>
                 <w:sz w:val="22"/>
               </w:rPr>
-              <w:t xml:space="preserve">UU No. 8 Tahun 1999 tentang Perlindungan Konsumen</w:t>
+              <w:t xml:space="preserve">UU 8 Thn 1999 (Perlindungan Konsumen)</w:t>
             </w:r>
             <w:r>
               <w:rPr>
@@ -900,7 +1068,44 @@
               <w:bottom w:val="single" w:color="000000" w:sz="4" w:space="0"/>
               <w:right w:val="single" w:color="000000" w:sz="4" w:space="0"/>
             </w:tcBorders>
-            <w:tcW w:w="1371" w:type="dxa"/>
+            <w:tcW w:w="4252" w:type="dxa"/>
+          </w:tcPr>
+          <w:p>
+            <w:pPr>
+              <w:pStyle w:val="989"/>
+              <w:spacing w:after="160" w:before="0"/>
+              <w:ind/>
+              <w:rPr>
+                <w:sz w:val="22"/>
+              </w:rPr>
+            </w:pPr>
+            <w:r>
+              <w:rPr>
+                <w:sz w:val="22"/>
+              </w:rPr>
+              <w:t xml:space="preserve">UU No. 8 Tahun 1999 tentang Perlindungan Konsumen</w:t>
+            </w:r>
+            <w:r>
+              <w:rPr>
+                <w:sz w:val="22"/>
+              </w:rPr>
+            </w:r>
+            <w:r>
+              <w:rPr>
+                <w:sz w:val="22"/>
+              </w:rPr>
+            </w:r>
+          </w:p>
+        </w:tc>
+        <w:tc>
+          <w:tcPr>
+            <w:tcBorders>
+              <w:top w:val="single" w:color="000000" w:sz="4" w:space="0"/>
+              <w:left w:val="single" w:color="000000" w:sz="4" w:space="0"/>
+              <w:bottom w:val="single" w:color="000000" w:sz="4" w:space="0"/>
+              <w:right w:val="single" w:color="000000" w:sz="4" w:space="0"/>
+            </w:tcBorders>
+            <w:tcW w:w="1477" w:type="dxa"/>
           </w:tcPr>
           <w:p>
             <w:pPr>
@@ -940,16 +1145,17 @@
               <w:bottom w:val="single" w:color="000000" w:sz="4" w:space="0"/>
               <w:right w:val="single" w:color="000000" w:sz="4" w:space="0"/>
             </w:tcBorders>
-            <w:tcW w:w="2955" w:type="dxa"/>
+            <w:tcW w:w="369" w:type="dxa"/>
           </w:tcPr>
           <w:p>
             <w:pPr>
-              <w:pStyle w:val="989"/>
-              <w:spacing w:after="160" w:before="0"/>
+              <w:spacing/>
               <w:ind/>
               <w:rPr>
                 <w:b/>
                 <w:bCs/>
+                <w:sz w:val="22"/>
+                <w:szCs w:val="22"/>
               </w:rPr>
             </w:pPr>
             <w:r>
@@ -957,19 +1163,15 @@
                 <w:b/>
                 <w:bCs/>
                 <w:sz w:val="22"/>
-              </w:rPr>
-              <w:t xml:space="preserve">Total unit yang dikodekan</w:t>
+                <w:szCs w:val="22"/>
+              </w:rPr>
             </w:r>
             <w:r>
               <w:rPr>
                 <w:b/>
                 <w:bCs/>
-              </w:rPr>
-            </w:r>
-            <w:r>
-              <w:rPr>
-                <w:b/>
-                <w:bCs/>
+                <w:sz w:val="22"/>
+                <w:szCs w:val="22"/>
               </w:rPr>
             </w:r>
           </w:p>
@@ -982,7 +1184,7 @@
               <w:bottom w:val="single" w:color="000000" w:sz="4" w:space="0"/>
               <w:right w:val="single" w:color="000000" w:sz="4" w:space="0"/>
             </w:tcBorders>
-            <w:tcW w:w="5032" w:type="dxa"/>
+            <w:tcW w:w="3260" w:type="dxa"/>
           </w:tcPr>
           <w:p>
             <w:pPr>
@@ -998,7 +1200,9 @@
               <w:rPr>
                 <w:b/>
                 <w:bCs/>
-              </w:rPr>
+                <w:sz w:val="22"/>
+              </w:rPr>
+              <w:t xml:space="preserve">Total unit yang dikodekan</w:t>
             </w:r>
             <w:r>
               <w:rPr>
@@ -1022,7 +1226,47 @@
               <w:bottom w:val="single" w:color="000000" w:sz="4" w:space="0"/>
               <w:right w:val="single" w:color="000000" w:sz="4" w:space="0"/>
             </w:tcBorders>
-            <w:tcW w:w="1371" w:type="dxa"/>
+            <w:tcW w:w="4252" w:type="dxa"/>
+          </w:tcPr>
+          <w:p>
+            <w:pPr>
+              <w:pStyle w:val="989"/>
+              <w:spacing w:after="160" w:before="0"/>
+              <w:ind/>
+              <w:rPr>
+                <w:b/>
+                <w:bCs/>
+              </w:rPr>
+            </w:pPr>
+            <w:r>
+              <w:rPr>
+                <w:b/>
+                <w:bCs/>
+              </w:rPr>
+            </w:r>
+            <w:r>
+              <w:rPr>
+                <w:b/>
+                <w:bCs/>
+              </w:rPr>
+            </w:r>
+            <w:r>
+              <w:rPr>
+                <w:b/>
+                <w:bCs/>
+              </w:rPr>
+            </w:r>
+          </w:p>
+        </w:tc>
+        <w:tc>
+          <w:tcPr>
+            <w:tcBorders>
+              <w:top w:val="single" w:color="000000" w:sz="4" w:space="0"/>
+              <w:left w:val="single" w:color="000000" w:sz="4" w:space="0"/>
+              <w:bottom w:val="single" w:color="000000" w:sz="4" w:space="0"/>
+              <w:right w:val="single" w:color="000000" w:sz="4" w:space="0"/>
+            </w:tcBorders>
+            <w:tcW w:w="1477" w:type="dxa"/>
           </w:tcPr>
           <w:p>
             <w:pPr>
@@ -1533,10 +1777,8 @@
         <w:pStyle w:val="991"/>
         <w:bidi w:val="false"/>
         <w:spacing/>
-        <w:ind w:right="0" w:firstLine="0" w:left="0"/>
-        <w:rPr>
-          <w:highlight w:val="none"/>
-        </w:rPr>
+        <w:ind w:right="0" w:hanging="283" w:left="283"/>
+        <w:rPr/>
       </w:pPr>
       <w:r>
         <w:t xml:space="preserve">3. Lembar </w:t>
@@ -2743,7 +2985,7 @@
               <w:rPr>
                 <w:sz w:val="22"/>
               </w:rPr>
-              <w:t xml:space="preserve">S1</w:t>
+              <w:t xml:space="preserve">S2</w:t>
             </w:r>
             <w:r>
               <w:rPr>
@@ -3516,36 +3758,10 @@
     </w:p>
     <w:p>
       <w:pPr>
-        <w:shd w:val="nil" w:color="ffffff"/>
-        <w:spacing/>
-        <w:ind/>
-        <w:rPr/>
-      </w:pPr>
-      <w:r>
-        <w:rPr>
-          <w:highlight w:val="none"/>
-        </w:rPr>
-        <w:br w:type="page" w:clear="all"/>
-      </w:r>
-      <w:r>
-        <w:rPr>
-          <w:highlight w:val="none"/>
-        </w:rPr>
-      </w:r>
-      <w:r>
-        <w:rPr>
-          <w:highlight w:val="none"/>
-        </w:rPr>
-      </w:r>
-    </w:p>
-    <w:p>
-      <w:pPr>
         <w:pStyle w:val="991"/>
         <w:spacing w:after="100" w:before="0"/>
         <w:ind w:right="0" w:hanging="283" w:left="283"/>
-        <w:rPr>
-          <w:highlight w:val="none"/>
-        </w:rPr>
+        <w:rPr/>
       </w:pPr>
       <w:r>
         <w:t xml:space="preserve">4. Daftar Variabel</w:t>
@@ -3590,9 +3806,9 @@
       </w:tblPr>
       <w:tblGrid>
         <w:gridCol w:w="555"/>
-        <w:gridCol w:w="914"/>
-        <w:gridCol w:w="1936"/>
-        <w:gridCol w:w="3510"/>
+        <w:gridCol w:w="1089"/>
+        <w:gridCol w:w="2126"/>
+        <w:gridCol w:w="3145"/>
         <w:gridCol w:w="900"/>
         <w:gridCol w:w="731"/>
         <w:gridCol w:w="799"/>
@@ -3652,7 +3868,7 @@
               <w:bottom w:val="single" w:color="000000" w:sz="4" w:space="0"/>
               <w:right w:val="single" w:color="000000" w:sz="4" w:space="0"/>
             </w:tcBorders>
-            <w:tcW w:w="914" w:type="dxa"/>
+            <w:tcW w:w="1089" w:type="dxa"/>
           </w:tcPr>
           <w:p>
             <w:pPr>
@@ -3693,7 +3909,7 @@
               <w:left w:val="single" w:color="000000" w:sz="4" w:space="0"/>
               <w:bottom w:val="single" w:color="000000" w:sz="4" w:space="0"/>
             </w:tcBorders>
-            <w:tcW w:w="1936" w:type="dxa"/>
+            <w:tcW w:w="2126" w:type="dxa"/>
           </w:tcPr>
           <w:p>
             <w:pPr>
@@ -3735,7 +3951,7 @@
               <w:bottom w:val="single" w:color="000000" w:sz="4" w:space="0"/>
               <w:right w:val="single" w:color="000000" w:sz="4" w:space="0"/>
             </w:tcBorders>
-            <w:tcW w:w="3510" w:type="dxa"/>
+            <w:tcW w:w="3145" w:type="dxa"/>
           </w:tcPr>
           <w:p>
             <w:pPr>
@@ -3946,7 +4162,7 @@
               <w:bottom w:val="single" w:color="000000" w:sz="4" w:space="0"/>
               <w:right w:val="single" w:color="000000" w:sz="4" w:space="0"/>
             </w:tcBorders>
-            <w:tcW w:w="914" w:type="dxa"/>
+            <w:tcW w:w="1089" w:type="dxa"/>
           </w:tcPr>
           <w:p>
             <w:pPr>
@@ -3986,7 +4202,7 @@
               <w:left w:val="single" w:color="000000" w:sz="4" w:space="0"/>
               <w:bottom w:val="single" w:color="000000" w:sz="4" w:space="0"/>
             </w:tcBorders>
-            <w:tcW w:w="1936" w:type="dxa"/>
+            <w:tcW w:w="2126" w:type="dxa"/>
           </w:tcPr>
           <w:p>
             <w:pPr>
@@ -4027,7 +4243,7 @@
               <w:bottom w:val="single" w:color="000000" w:sz="4" w:space="0"/>
               <w:right w:val="single" w:color="000000" w:sz="4" w:space="0"/>
             </w:tcBorders>
-            <w:tcW w:w="3510" w:type="dxa"/>
+            <w:tcW w:w="3145" w:type="dxa"/>
           </w:tcPr>
           <w:p>
             <w:pPr>
@@ -4251,7 +4467,7 @@
               <w:bottom w:val="single" w:color="000000" w:sz="4" w:space="0"/>
               <w:right w:val="single" w:color="000000" w:sz="4" w:space="0"/>
             </w:tcBorders>
-            <w:tcW w:w="914" w:type="dxa"/>
+            <w:tcW w:w="1089" w:type="dxa"/>
           </w:tcPr>
           <w:p>
             <w:pPr>
@@ -4291,7 +4507,7 @@
               <w:left w:val="single" w:color="000000" w:sz="4" w:space="0"/>
               <w:bottom w:val="single" w:color="000000" w:sz="4" w:space="0"/>
             </w:tcBorders>
-            <w:tcW w:w="1936" w:type="dxa"/>
+            <w:tcW w:w="2126" w:type="dxa"/>
           </w:tcPr>
           <w:p>
             <w:pPr>
@@ -4332,7 +4548,7 @@
               <w:bottom w:val="single" w:color="000000" w:sz="4" w:space="0"/>
               <w:right w:val="single" w:color="000000" w:sz="4" w:space="0"/>
             </w:tcBorders>
-            <w:tcW w:w="3510" w:type="dxa"/>
+            <w:tcW w:w="3145" w:type="dxa"/>
           </w:tcPr>
           <w:p>
             <w:pPr>
@@ -4556,7 +4772,7 @@
               <w:bottom w:val="single" w:color="000000" w:sz="4" w:space="0"/>
               <w:right w:val="single" w:color="000000" w:sz="4" w:space="0"/>
             </w:tcBorders>
-            <w:tcW w:w="914" w:type="dxa"/>
+            <w:tcW w:w="1089" w:type="dxa"/>
           </w:tcPr>
           <w:p>
             <w:pPr>
@@ -4596,7 +4812,7 @@
               <w:left w:val="single" w:color="000000" w:sz="4" w:space="0"/>
               <w:bottom w:val="single" w:color="000000" w:sz="4" w:space="0"/>
             </w:tcBorders>
-            <w:tcW w:w="1936" w:type="dxa"/>
+            <w:tcW w:w="2126" w:type="dxa"/>
           </w:tcPr>
           <w:p>
             <w:pPr>
@@ -4637,7 +4853,7 @@
               <w:bottom w:val="single" w:color="000000" w:sz="4" w:space="0"/>
               <w:right w:val="single" w:color="000000" w:sz="4" w:space="0"/>
             </w:tcBorders>
-            <w:tcW w:w="3510" w:type="dxa"/>
+            <w:tcW w:w="3145" w:type="dxa"/>
           </w:tcPr>
           <w:p>
             <w:pPr>
@@ -4859,7 +5075,7 @@
               <w:bottom w:val="single" w:color="000000" w:sz="4" w:space="0"/>
               <w:right w:val="single" w:color="000000" w:sz="4" w:space="0"/>
             </w:tcBorders>
-            <w:tcW w:w="914" w:type="dxa"/>
+            <w:tcW w:w="1089" w:type="dxa"/>
           </w:tcPr>
           <w:p>
             <w:pPr>
@@ -4898,7 +5114,7 @@
               <w:left w:val="single" w:color="000000" w:sz="4" w:space="0"/>
               <w:bottom w:val="single" w:color="000000" w:sz="4" w:space="0"/>
             </w:tcBorders>
-            <w:tcW w:w="1936" w:type="dxa"/>
+            <w:tcW w:w="2126" w:type="dxa"/>
           </w:tcPr>
           <w:p>
             <w:pPr>
@@ -4938,7 +5154,7 @@
               <w:bottom w:val="single" w:color="000000" w:sz="4" w:space="0"/>
               <w:right w:val="single" w:color="000000" w:sz="4" w:space="0"/>
             </w:tcBorders>
-            <w:tcW w:w="3510" w:type="dxa"/>
+            <w:tcW w:w="3145" w:type="dxa"/>
           </w:tcPr>
           <w:p>
             <w:pPr>
@@ -4955,7 +5171,7 @@
                 <w:sz w:val="18"/>
                 <w:szCs w:val="18"/>
               </w:rPr>
-              <w:t xml:space="preserve">Pihak yang dituju teks. Lihat Bagian 7.1</w:t>
+              <w:t xml:space="preserve">Subjek norma utama, diperiksa berurutan S1 &gt; S2 &gt; S3 &gt; S4 &gt; S5 &gt; S6 &gt; S7 &gt; S8 &gt; S9. Lihat Bagian 7.1</w:t>
             </w:r>
             <w:r>
               <w:rPr>
@@ -5143,7 +5359,7 @@
               <w:bottom w:val="single" w:color="000000" w:sz="4" w:space="0"/>
               <w:right w:val="single" w:color="000000" w:sz="4" w:space="0"/>
             </w:tcBorders>
-            <w:tcW w:w="914" w:type="dxa"/>
+            <w:tcW w:w="1089" w:type="dxa"/>
           </w:tcPr>
           <w:p>
             <w:pPr>
@@ -5183,7 +5399,7 @@
               <w:left w:val="single" w:color="000000" w:sz="4" w:space="0"/>
               <w:bottom w:val="single" w:color="000000" w:sz="4" w:space="0"/>
             </w:tcBorders>
-            <w:tcW w:w="1936" w:type="dxa"/>
+            <w:tcW w:w="2126" w:type="dxa"/>
           </w:tcPr>
           <w:p>
             <w:pPr>
@@ -5224,7 +5440,7 @@
               <w:bottom w:val="single" w:color="000000" w:sz="4" w:space="0"/>
               <w:right w:val="single" w:color="000000" w:sz="4" w:space="0"/>
             </w:tcBorders>
-            <w:tcW w:w="3510" w:type="dxa"/>
+            <w:tcW w:w="3145" w:type="dxa"/>
           </w:tcPr>
           <w:p>
             <w:pPr>
@@ -5434,7 +5650,7 @@
               <w:bottom w:val="single" w:color="000000" w:sz="4" w:space="0"/>
               <w:right w:val="single" w:color="000000" w:sz="4" w:space="0"/>
             </w:tcBorders>
-            <w:tcW w:w="914" w:type="dxa"/>
+            <w:tcW w:w="1089" w:type="dxa"/>
           </w:tcPr>
           <w:p>
             <w:pPr>
@@ -5474,7 +5690,7 @@
               <w:left w:val="single" w:color="000000" w:sz="4" w:space="0"/>
               <w:bottom w:val="single" w:color="000000" w:sz="4" w:space="0"/>
             </w:tcBorders>
-            <w:tcW w:w="1936" w:type="dxa"/>
+            <w:tcW w:w="2126" w:type="dxa"/>
           </w:tcPr>
           <w:p>
             <w:pPr>
@@ -5515,7 +5731,7 @@
               <w:bottom w:val="single" w:color="000000" w:sz="4" w:space="0"/>
               <w:right w:val="single" w:color="000000" w:sz="4" w:space="0"/>
             </w:tcBorders>
-            <w:tcW w:w="3510" w:type="dxa"/>
+            <w:tcW w:w="3145" w:type="dxa"/>
           </w:tcPr>
           <w:p>
             <w:pPr>
@@ -5723,7 +5939,7 @@
               <w:bottom w:val="single" w:color="000000" w:sz="4" w:space="0"/>
               <w:right w:val="single" w:color="000000" w:sz="4" w:space="0"/>
             </w:tcBorders>
-            <w:tcW w:w="914" w:type="dxa"/>
+            <w:tcW w:w="1089" w:type="dxa"/>
           </w:tcPr>
           <w:p>
             <w:pPr>
@@ -5763,7 +5979,7 @@
               <w:left w:val="single" w:color="000000" w:sz="4" w:space="0"/>
               <w:bottom w:val="single" w:color="000000" w:sz="4" w:space="0"/>
             </w:tcBorders>
-            <w:tcW w:w="1936" w:type="dxa"/>
+            <w:tcW w:w="2126" w:type="dxa"/>
           </w:tcPr>
           <w:p>
             <w:pPr>
@@ -5804,7 +6020,7 @@
               <w:bottom w:val="single" w:color="000000" w:sz="4" w:space="0"/>
               <w:right w:val="single" w:color="000000" w:sz="4" w:space="0"/>
             </w:tcBorders>
-            <w:tcW w:w="3510" w:type="dxa"/>
+            <w:tcW w:w="3145" w:type="dxa"/>
           </w:tcPr>
           <w:p>
             <w:pPr>
@@ -6012,7 +6228,7 @@
               <w:bottom w:val="single" w:color="000000" w:sz="4" w:space="0"/>
               <w:right w:val="single" w:color="000000" w:sz="4" w:space="0"/>
             </w:tcBorders>
-            <w:tcW w:w="914" w:type="dxa"/>
+            <w:tcW w:w="1089" w:type="dxa"/>
           </w:tcPr>
           <w:p>
             <w:pPr>
@@ -6052,7 +6268,7 @@
               <w:left w:val="single" w:color="000000" w:sz="4" w:space="0"/>
               <w:bottom w:val="single" w:color="000000" w:sz="4" w:space="0"/>
             </w:tcBorders>
-            <w:tcW w:w="1936" w:type="dxa"/>
+            <w:tcW w:w="2126" w:type="dxa"/>
           </w:tcPr>
           <w:p>
             <w:pPr>
@@ -6093,7 +6309,7 @@
               <w:bottom w:val="single" w:color="000000" w:sz="4" w:space="0"/>
               <w:right w:val="single" w:color="000000" w:sz="4" w:space="0"/>
             </w:tcBorders>
-            <w:tcW w:w="3510" w:type="dxa"/>
+            <w:tcW w:w="3145" w:type="dxa"/>
           </w:tcPr>
           <w:p>
             <w:pPr>
@@ -6301,7 +6517,7 @@
               <w:bottom w:val="single" w:color="000000" w:sz="4" w:space="0"/>
               <w:right w:val="single" w:color="000000" w:sz="4" w:space="0"/>
             </w:tcBorders>
-            <w:tcW w:w="914" w:type="dxa"/>
+            <w:tcW w:w="1089" w:type="dxa"/>
           </w:tcPr>
           <w:p>
             <w:pPr>
@@ -6341,7 +6557,7 @@
               <w:left w:val="single" w:color="000000" w:sz="4" w:space="0"/>
               <w:bottom w:val="single" w:color="000000" w:sz="4" w:space="0"/>
             </w:tcBorders>
-            <w:tcW w:w="1936" w:type="dxa"/>
+            <w:tcW w:w="2126" w:type="dxa"/>
           </w:tcPr>
           <w:p>
             <w:pPr>
@@ -6382,7 +6598,7 @@
               <w:bottom w:val="single" w:color="000000" w:sz="4" w:space="0"/>
               <w:right w:val="single" w:color="000000" w:sz="4" w:space="0"/>
             </w:tcBorders>
-            <w:tcW w:w="3510" w:type="dxa"/>
+            <w:tcW w:w="3145" w:type="dxa"/>
           </w:tcPr>
           <w:p>
             <w:pPr>
@@ -6399,7 +6615,7 @@
                 <w:sz w:val="18"/>
                 <w:szCs w:val="18"/>
               </w:rPr>
-              <w:t xml:space="preserve">Kandidat jenis kebutuhan SRS diperiksa berurutan K1 -&gt; K2 -&gt; K3 -&gt; K4 -&gt; K5. Lihat Bagian 7.6</w:t>
+              <w:t xml:space="preserve">Kandidat jenis kebutuhan SRS diperiksa berurutan K1 &gt; K2 &gt; K3 &gt; K4 &gt; K5. Lihat Bagian 7.6</w:t>
             </w:r>
             <w:r>
               <w:rPr>
@@ -6590,7 +6806,7 @@
               <w:bottom w:val="single" w:color="000000" w:sz="4" w:space="0"/>
               <w:right w:val="single" w:color="000000" w:sz="4" w:space="0"/>
             </w:tcBorders>
-            <w:tcW w:w="914" w:type="dxa"/>
+            <w:tcW w:w="1089" w:type="dxa"/>
           </w:tcPr>
           <w:p>
             <w:pPr>
@@ -6630,7 +6846,7 @@
               <w:left w:val="single" w:color="000000" w:sz="4" w:space="0"/>
               <w:bottom w:val="single" w:color="000000" w:sz="4" w:space="0"/>
             </w:tcBorders>
-            <w:tcW w:w="1936" w:type="dxa"/>
+            <w:tcW w:w="2126" w:type="dxa"/>
           </w:tcPr>
           <w:p>
             <w:pPr>
@@ -6671,7 +6887,7 @@
               <w:bottom w:val="single" w:color="000000" w:sz="4" w:space="0"/>
               <w:right w:val="single" w:color="000000" w:sz="4" w:space="0"/>
             </w:tcBorders>
-            <w:tcW w:w="3510" w:type="dxa"/>
+            <w:tcW w:w="3145" w:type="dxa"/>
           </w:tcPr>
           <w:p>
             <w:pPr>
@@ -6879,7 +7095,7 @@
               <w:bottom w:val="single" w:color="000000" w:sz="4" w:space="0"/>
               <w:right w:val="single" w:color="000000" w:sz="4" w:space="0"/>
             </w:tcBorders>
-            <w:tcW w:w="914" w:type="dxa"/>
+            <w:tcW w:w="1089" w:type="dxa"/>
           </w:tcPr>
           <w:p>
             <w:pPr>
@@ -6919,7 +7135,7 @@
               <w:left w:val="single" w:color="000000" w:sz="4" w:space="0"/>
               <w:bottom w:val="single" w:color="000000" w:sz="4" w:space="0"/>
             </w:tcBorders>
-            <w:tcW w:w="1936" w:type="dxa"/>
+            <w:tcW w:w="2126" w:type="dxa"/>
           </w:tcPr>
           <w:p>
             <w:pPr>
@@ -6960,7 +7176,7 @@
               <w:bottom w:val="single" w:color="000000" w:sz="4" w:space="0"/>
               <w:right w:val="single" w:color="000000" w:sz="4" w:space="0"/>
             </w:tcBorders>
-            <w:tcW w:w="3510" w:type="dxa"/>
+            <w:tcW w:w="3145" w:type="dxa"/>
           </w:tcPr>
           <w:p>
             <w:pPr>
@@ -7168,7 +7384,7 @@
               <w:bottom w:val="single" w:color="000000" w:sz="4" w:space="0"/>
               <w:right w:val="single" w:color="000000" w:sz="4" w:space="0"/>
             </w:tcBorders>
-            <w:tcW w:w="914" w:type="dxa"/>
+            <w:tcW w:w="1089" w:type="dxa"/>
           </w:tcPr>
           <w:p>
             <w:pPr>
@@ -7208,7 +7424,7 @@
               <w:left w:val="single" w:color="000000" w:sz="4" w:space="0"/>
               <w:bottom w:val="single" w:color="000000" w:sz="4" w:space="0"/>
             </w:tcBorders>
-            <w:tcW w:w="1936" w:type="dxa"/>
+            <w:tcW w:w="2126" w:type="dxa"/>
           </w:tcPr>
           <w:p>
             <w:pPr>
@@ -7249,7 +7465,7 @@
               <w:bottom w:val="single" w:color="000000" w:sz="4" w:space="0"/>
               <w:right w:val="single" w:color="000000" w:sz="4" w:space="0"/>
             </w:tcBorders>
-            <w:tcW w:w="3510" w:type="dxa"/>
+            <w:tcW w:w="3145" w:type="dxa"/>
           </w:tcPr>
           <w:p>
             <w:pPr>
@@ -7409,31 +7625,27 @@
     </w:tbl>
     <w:p>
       <w:pPr>
-        <w:shd w:val="nil" w:color="ffffff"/>
-        <w:spacing/>
-        <w:ind/>
-        <w:rPr/>
+        <w:pStyle w:val="989"/>
+        <w:bidi w:val="false"/>
+        <w:spacing/>
+        <w:ind/>
+        <w:rPr>
+          <w:b/>
+        </w:rPr>
       </w:pPr>
       <w:r>
         <w:rPr>
-          <w:i/>
-          <w:iCs/>
-          <w:highlight w:val="none"/>
-        </w:rPr>
-        <w:br w:type="page" w:clear="all"/>
-      </w:r>
-      <w:r>
-        <w:rPr>
-          <w:i/>
-          <w:iCs/>
-          <w:highlight w:val="none"/>
+          <w:b/>
         </w:rPr>
       </w:r>
       <w:r>
         <w:rPr>
-          <w:i/>
-          <w:iCs/>
-          <w:highlight w:val="none"/>
+          <w:b/>
+        </w:rPr>
+      </w:r>
+      <w:r>
+        <w:rPr>
+          <w:b/>
         </w:rPr>
       </w:r>
     </w:p>
@@ -7442,11 +7654,7 @@
         <w:pStyle w:val="991"/>
         <w:spacing/>
         <w:ind w:right="0" w:hanging="283" w:left="283"/>
-        <w:rPr>
-          <w:bCs/>
-          <w:i/>
-          <w:highlight w:val="none"/>
-        </w:rPr>
+        <w:rPr/>
       </w:pPr>
       <w:r>
         <w:t xml:space="preserve">5. Prosedur </w:t>
@@ -7900,61 +8108,11 @@
     </w:p>
     <w:p>
       <w:pPr>
-        <w:pStyle w:val="989"/>
-        <w:spacing/>
-        <w:ind/>
-        <w:rPr/>
-      </w:pPr>
-      <w:r>
-        <w:rPr>
-          <w:highlight w:val="none"/>
-        </w:rPr>
-      </w:r>
-      <w:r>
-        <w:rPr>
-          <w:highlight w:val="none"/>
-        </w:rPr>
-      </w:r>
-      <w:r>
-        <w:rPr>
-          <w:highlight w:val="none"/>
-        </w:rPr>
-      </w:r>
-    </w:p>
-    <w:p>
-      <w:pPr>
-        <w:shd w:val="nil" w:color="ffffff"/>
-        <w:bidi w:val="false"/>
-        <w:spacing/>
-        <w:ind/>
-        <w:rPr/>
-      </w:pPr>
-      <w:r>
-        <w:rPr>
-          <w:highlight w:val="none"/>
-        </w:rPr>
-        <w:br w:type="page" w:clear="all"/>
-      </w:r>
-      <w:r>
-        <w:rPr>
-          <w:highlight w:val="none"/>
-        </w:rPr>
-      </w:r>
-      <w:r>
-        <w:rPr>
-          <w:highlight w:val="none"/>
-        </w:rPr>
-      </w:r>
-    </w:p>
-    <w:p>
-      <w:pPr>
         <w:pStyle w:val="991"/>
         <w:bidi w:val="false"/>
         <w:spacing/>
         <w:ind w:right="0" w:hanging="283" w:left="283"/>
-        <w:rPr>
-          <w:highlight w:val="none"/>
-        </w:rPr>
+        <w:rPr/>
       </w:pPr>
       <w:r>
         <w:t xml:space="preserve">6. Kerangka Penalaran: Menghubungkan Teks Hukum dengan Web Scraping</w:t>
@@ -8299,7 +8457,6 @@
         <w:pStyle w:val="989"/>
         <w:spacing/>
         <w:ind w:firstLine="0" w:left="0"/>
-        <w:jc w:val="center"/>
         <w:rPr>
           <w:b w:val="0"/>
           <w:bCs w:val="0"/>
@@ -8340,7 +8497,7 @@
             <v:path o:extrusionok="f" gradientshapeok="t" o:connecttype="rect"/>
             <o:lock v:ext="edit" aspectratio="t"/>
           </v:shapetype>
-          <v:shape id="_x0000_i0" o:spid="_x0000_s0" type="#_x0000_t75" style="width:388.65pt;height:229.51pt;mso-wrap-distance-left:0.00pt;mso-wrap-distance-top:0.00pt;mso-wrap-distance-right:0.00pt;mso-wrap-distance-bottom:0.00pt;rotation:0;z-index:1;" filled="f" stroked="false">
+          <v:shape id="_x0000_i0" o:spid="_x0000_s0" type="#_x0000_t75" style="width:455.59pt;height:259.29pt;mso-wrap-distance-left:0.00pt;mso-wrap-distance-top:0.00pt;mso-wrap-distance-right:0.00pt;mso-wrap-distance-bottom:0.00pt;rotation:0;z-index:1;" filled="f" stroked="false">
             <v:imagedata r:id="rId12" o:title=""/>
             <o:lock v:ext="edit" rotation="t"/>
           </v:shape>
@@ -8366,36 +8523,37 @@
     </w:p>
     <w:p>
       <w:pPr>
-        <w:shd w:val="nil" w:color="ffffff"/>
-        <w:spacing/>
-        <w:ind/>
+        <w:pStyle w:val="989"/>
+        <w:spacing/>
+        <w:ind w:firstLine="0" w:left="0"/>
         <w:rPr/>
       </w:pPr>
       <w:r>
         <w:rPr>
-          <w:highlight w:val="none"/>
-        </w:rPr>
-        <w:br w:type="page" w:clear="all"/>
-      </w:r>
-      <w:r>
-        <w:rPr>
+          <w:b w:val="0"/>
+          <w:bCs w:val="0"/>
+          <w:i w:val="0"/>
+          <w:iCs w:val="0"/>
           <w:highlight w:val="none"/>
         </w:rPr>
       </w:r>
       <w:r>
         <w:rPr>
+          <w:b w:val="0"/>
+          <w:bCs w:val="0"/>
+          <w:i w:val="0"/>
+          <w:iCs w:val="0"/>
           <w:highlight w:val="none"/>
         </w:rPr>
       </w:r>
+      <w:r/>
     </w:p>
     <w:p>
       <w:pPr>
         <w:pStyle w:val="991"/>
         <w:spacing w:after="100" w:before="0"/>
         <w:ind w:right="0" w:hanging="283" w:left="283"/>
-        <w:rPr>
-          <w:highlight w:val="none"/>
-        </w:rPr>
+        <w:rPr/>
       </w:pPr>
       <w:r>
         <w:t xml:space="preserve">7. Definisi Kategori</w:t>
@@ -8431,7 +8589,13 @@
         <w:t xml:space="preserve">Isi”</w:t>
       </w:r>
       <w:r>
-        <w:t xml:space="preserve">. Jangan menyimpulkan subjek dari judul BAB.</w:t>
+        <w:t xml:space="preserve">. Jangan menyimpulkan subjek dari judul BAB. </w:t>
+      </w:r>
+      <w:r>
+        <w:t xml:space="preserve">Bila unit berayat, pakai ayat dominan. Pihak yang hanya disebut sebagai objek atau p</w:t>
+      </w:r>
+      <w:r>
+        <w:t xml:space="preserve">elengkap tidak menentukan kode. Tanyakan secara berurutan apakah subjek norma utama itu termasuk S1, S2, S3, S4, S5, S6, S7, atau S8, dan berhenti pada jawaban “Ya” pertama (S1 &gt; S2 &gt; S3 &gt; S4 &gt; S5 &gt; S6 &gt; S7 &gt; S8). Bila tidak ada pelaku eksplisit, pilih S9.</w:t>
       </w:r>
       <w:r/>
     </w:p>
@@ -8635,7 +8799,7 @@
               <w:rPr>
                 <w:sz w:val="22"/>
               </w:rPr>
-              <w:t xml:space="preserve">Pengendali Data Pribadi</w:t>
+              <w:t xml:space="preserve">Pengendali dan Prosesor</w:t>
             </w:r>
             <w:r>
               <w:rPr>
@@ -8672,21 +8836,7 @@
               <w:rPr>
                 <w:sz w:val="22"/>
               </w:rPr>
-              <w:t xml:space="preserve">Pihak yang menjalankan aplikasi pengumpul data (</w:t>
-            </w:r>
-            <w:r>
-              <w:rPr>
-                <w:i/>
-                <w:iCs/>
-                <w:sz w:val="22"/>
-              </w:rPr>
-              <w:t xml:space="preserve">scraper</w:t>
-            </w:r>
-            <w:r>
-              <w:rPr>
-                <w:sz w:val="22"/>
-              </w:rPr>
-              <w:t xml:space="preserve">). Pihak ini menentukan tujuan dan cara pemrosesan data.</w:t>
+              <w:t xml:space="preserve">Pengendali (S2) dan Prosesor (S3) disebut bersamaan sebagai subjek norma.</w:t>
             </w:r>
             <w:r>
               <w:rPr>
@@ -8763,7 +8913,7 @@
               <w:rPr>
                 <w:sz w:val="22"/>
               </w:rPr>
-              <w:t xml:space="preserve">Prosesor Data Pribadi</w:t>
+              <w:t xml:space="preserve">Pengendali Data Pribadi</w:t>
             </w:r>
             <w:r>
               <w:rPr>
@@ -8800,7 +8950,21 @@
               <w:rPr>
                 <w:sz w:val="22"/>
               </w:rPr>
-              <w:t xml:space="preserve">Pihak yang melakukan pemrosesan data pribadi pihak lain.</w:t>
+              <w:t xml:space="preserve">Pihak yang menjalankan aplikasi pengumpul data (</w:t>
+            </w:r>
+            <w:r>
+              <w:rPr>
+                <w:i/>
+                <w:iCs/>
+                <w:sz w:val="22"/>
+              </w:rPr>
+              <w:t xml:space="preserve">scraper</w:t>
+            </w:r>
+            <w:r>
+              <w:rPr>
+                <w:sz w:val="22"/>
+              </w:rPr>
+              <w:t xml:space="preserve">). Pihak ini menentukan tujuan dan cara pemrosesan data.</w:t>
             </w:r>
             <w:r>
               <w:rPr>
@@ -8877,7 +9041,7 @@
               <w:rPr>
                 <w:sz w:val="22"/>
               </w:rPr>
-              <w:t xml:space="preserve">Pengendali dan Prosesor</w:t>
+              <w:t xml:space="preserve">Prosesor Data Pribadi</w:t>
             </w:r>
             <w:r>
               <w:rPr>
@@ -8914,7 +9078,7 @@
               <w:rPr>
                 <w:sz w:val="22"/>
               </w:rPr>
-              <w:t xml:space="preserve">Kedua S1 dan S2 disebut bersamaan.</w:t>
+              <w:t xml:space="preserve">Pihak yang melakukan pemrosesan data pribadi pihak lain.</w:t>
             </w:r>
             <w:r>
               <w:rPr>
@@ -9142,7 +9306,7 @@
               <w:rPr>
                 <w:sz w:val="22"/>
               </w:rPr>
-              <w:t xml:space="preserve">"Setiap Orang", "Setiap orang", “setiap orang”, atau pihak umum lain, termasuk Badan Publik (pemerintah) dan Organisasi Internasional bila disebut bersama.</w:t>
+              <w:t xml:space="preserve">“Setiap Orang” (huruf besar atau kecil) atau pihak umum lain, termasuk Badan Publik (pemerintah) dan Organisasi Internasional bila disebut bersama.</w:t>
             </w:r>
             <w:r>
               <w:rPr>
@@ -9598,7 +9762,7 @@
               <w:rPr>
                 <w:sz w:val="22"/>
               </w:rPr>
-              <w:t xml:space="preserve">Teks hanya berisi definisi, asas, kalimat pasif tanpa pelaku, dan opini umum.</w:t>
+              <w:t xml:space="preserve">Teks hanya berisi definisi, asas, kalimat pasif tanpa pelaku, atau opini umum.</w:t>
             </w:r>
             <w:r>
               <w:rPr>
@@ -17287,36 +17451,10 @@
     </w:p>
     <w:p>
       <w:pPr>
-        <w:shd w:val="nil" w:color="ffffff"/>
-        <w:spacing/>
-        <w:ind/>
-        <w:rPr/>
-      </w:pPr>
-      <w:r>
-        <w:rPr>
-          <w:highlight w:val="none"/>
-        </w:rPr>
-        <w:br w:type="page" w:clear="all"/>
-      </w:r>
-      <w:r>
-        <w:rPr>
-          <w:highlight w:val="none"/>
-        </w:rPr>
-      </w:r>
-      <w:r>
-        <w:rPr>
-          <w:highlight w:val="none"/>
-        </w:rPr>
-      </w:r>
-    </w:p>
-    <w:p>
-      <w:pPr>
         <w:pStyle w:val="991"/>
         <w:spacing w:after="100" w:before="0"/>
         <w:ind w:right="0" w:hanging="283" w:left="283"/>
-        <w:rPr>
-          <w:highlight w:val="none"/>
-        </w:rPr>
+        <w:rPr/>
       </w:pPr>
       <w:r>
         <w:t xml:space="preserve">8. Aturan Unit Majemuk</w:t>
@@ -17446,7 +17584,7 @@
         <w:t xml:space="preserve">Subjek (V4):</w:t>
       </w:r>
       <w:r>
-        <w:t xml:space="preserve"> subjek norma pertama. Bila Pengendali dan Prosesor disebut sama-sama, pilih S3.</w:t>
+        <w:t xml:space="preserve"> subjek norma utama pada ayat dominan, dengan urutan pemeriksaan pada Bagian 7.1. Bila Pengendali dan Prosesor disebut sama-sama sebagai subjek, pilih S1.</w:t>
       </w:r>
       <w:r/>
     </w:p>
@@ -17558,59 +17696,10 @@
     </w:p>
     <w:p>
       <w:pPr>
-        <w:pStyle w:val="989"/>
-        <w:spacing/>
-        <w:ind/>
-        <w:rPr/>
-      </w:pPr>
-      <w:r>
-        <w:rPr>
-          <w:highlight w:val="none"/>
-        </w:rPr>
-      </w:r>
-      <w:r>
-        <w:rPr>
-          <w:highlight w:val="none"/>
-        </w:rPr>
-      </w:r>
-      <w:r>
-        <w:rPr>
-          <w:highlight w:val="none"/>
-        </w:rPr>
-      </w:r>
-    </w:p>
-    <w:p>
-      <w:pPr>
-        <w:shd w:val="nil" w:color="ffffff"/>
-        <w:spacing/>
-        <w:ind/>
-        <w:rPr/>
-      </w:pPr>
-      <w:r>
-        <w:rPr>
-          <w:highlight w:val="none"/>
-        </w:rPr>
-        <w:br w:type="page" w:clear="all"/>
-      </w:r>
-      <w:r>
-        <w:rPr>
-          <w:highlight w:val="none"/>
-        </w:rPr>
-      </w:r>
-      <w:r>
-        <w:rPr>
-          <w:highlight w:val="none"/>
-        </w:rPr>
-      </w:r>
-    </w:p>
-    <w:p>
-      <w:pPr>
         <w:pStyle w:val="991"/>
         <w:spacing w:after="100" w:before="0"/>
         <w:ind w:right="0" w:hanging="283" w:left="283"/>
-        <w:rPr>
-          <w:highlight w:val="none"/>
-        </w:rPr>
+        <w:rPr/>
       </w:pPr>
       <w:r>
         <w:t xml:space="preserve">9. Aturan Konsistensi</w:t>
@@ -17656,8 +17745,9 @@
         <w:tblLook w:val="04A0" w:firstRow="1" w:lastRow="0" w:firstColumn="1" w:lastColumn="0" w:noHBand="0" w:noVBand="1"/>
       </w:tblPr>
       <w:tblGrid>
-        <w:gridCol w:w="3912"/>
-        <w:gridCol w:w="5448"/>
+        <w:gridCol w:w="511"/>
+        <w:gridCol w:w="2976"/>
+        <w:gridCol w:w="5873"/>
       </w:tblGrid>
       <w:tr>
         <w:trPr>
@@ -17665,38 +17755,35 @@
         </w:trPr>
         <w:tc>
           <w:tcPr>
-            <w:shd w:val="clear" w:color="auto" w:fill="f2f2f2"/>
+            <w:shd w:val="clear" w:color="ffffff" w:fill="f2f2f2"/>
             <w:tcBorders>
               <w:top w:val="single" w:color="000000" w:sz="4" w:space="0"/>
               <w:left w:val="single" w:color="000000" w:sz="4" w:space="0"/>
               <w:bottom w:val="single" w:color="000000" w:sz="4" w:space="0"/>
               <w:right w:val="single" w:color="000000" w:sz="4" w:space="0"/>
             </w:tcBorders>
-            <w:tcW w:w="3912" w:type="dxa"/>
+            <w:tcW w:w="511" w:type="dxa"/>
           </w:tcPr>
           <w:p>
             <w:pPr>
-              <w:pStyle w:val="989"/>
-              <w:spacing w:after="160" w:before="0"/>
+              <w:spacing/>
               <w:ind/>
               <w:rPr>
                 <w:sz w:val="22"/>
+                <w:szCs w:val="22"/>
               </w:rPr>
             </w:pPr>
             <w:r>
               <w:rPr>
                 <w:sz w:val="22"/>
-              </w:rPr>
-              <w:t xml:space="preserve">Aturan</w:t>
-            </w:r>
-            <w:r>
-              <w:rPr>
-                <w:sz w:val="22"/>
-              </w:rPr>
-            </w:r>
-            <w:r>
-              <w:rPr>
-                <w:sz w:val="22"/>
+                <w:szCs w:val="22"/>
+              </w:rPr>
+              <w:t xml:space="preserve">#</w:t>
+            </w:r>
+            <w:r>
+              <w:rPr>
+                <w:sz w:val="22"/>
+                <w:szCs w:val="22"/>
               </w:rPr>
             </w:r>
           </w:p>
@@ -17710,7 +17797,45 @@
               <w:bottom w:val="single" w:color="000000" w:sz="4" w:space="0"/>
               <w:right w:val="single" w:color="000000" w:sz="4" w:space="0"/>
             </w:tcBorders>
-            <w:tcW w:w="5448" w:type="dxa"/>
+            <w:tcW w:w="2976" w:type="dxa"/>
+          </w:tcPr>
+          <w:p>
+            <w:pPr>
+              <w:pStyle w:val="989"/>
+              <w:spacing w:after="160" w:before="0"/>
+              <w:ind/>
+              <w:rPr>
+                <w:sz w:val="22"/>
+              </w:rPr>
+            </w:pPr>
+            <w:r>
+              <w:rPr>
+                <w:sz w:val="22"/>
+              </w:rPr>
+              <w:t xml:space="preserve">Aturan</w:t>
+            </w:r>
+            <w:r>
+              <w:rPr>
+                <w:sz w:val="22"/>
+              </w:rPr>
+            </w:r>
+            <w:r>
+              <w:rPr>
+                <w:sz w:val="22"/>
+              </w:rPr>
+            </w:r>
+          </w:p>
+        </w:tc>
+        <w:tc>
+          <w:tcPr>
+            <w:shd w:val="clear" w:color="auto" w:fill="f2f2f2"/>
+            <w:tcBorders>
+              <w:top w:val="single" w:color="000000" w:sz="4" w:space="0"/>
+              <w:left w:val="single" w:color="000000" w:sz="4" w:space="0"/>
+              <w:bottom w:val="single" w:color="000000" w:sz="4" w:space="0"/>
+              <w:right w:val="single" w:color="000000" w:sz="4" w:space="0"/>
+            </w:tcBorders>
+            <w:tcW w:w="5873" w:type="dxa"/>
           </w:tcPr>
           <w:p>
             <w:pPr>
@@ -17752,31 +17877,28 @@
               <w:bottom w:val="single" w:color="000000" w:sz="4" w:space="0"/>
               <w:right w:val="single" w:color="000000" w:sz="4" w:space="0"/>
             </w:tcBorders>
-            <w:tcW w:w="3912" w:type="dxa"/>
+            <w:tcW w:w="511" w:type="dxa"/>
           </w:tcPr>
           <w:p>
             <w:pPr>
-              <w:pStyle w:val="989"/>
-              <w:spacing w:after="160" w:before="0"/>
+              <w:spacing/>
               <w:ind/>
               <w:rPr>
                 <w:sz w:val="22"/>
+                <w:szCs w:val="22"/>
               </w:rPr>
             </w:pPr>
             <w:r>
               <w:rPr>
                 <w:sz w:val="22"/>
-              </w:rPr>
-              <w:t xml:space="preserve">R0 harus berpasangan dengan K5</w:t>
-            </w:r>
-            <w:r>
-              <w:rPr>
-                <w:sz w:val="22"/>
-              </w:rPr>
-            </w:r>
-            <w:r>
-              <w:rPr>
-                <w:sz w:val="22"/>
+                <w:szCs w:val="22"/>
+              </w:rPr>
+              <w:t xml:space="preserve">1</w:t>
+            </w:r>
+            <w:r>
+              <w:rPr>
+                <w:sz w:val="22"/>
+                <w:szCs w:val="22"/>
               </w:rPr>
             </w:r>
           </w:p>
@@ -17789,7 +17911,44 @@
               <w:bottom w:val="single" w:color="000000" w:sz="4" w:space="0"/>
               <w:right w:val="single" w:color="000000" w:sz="4" w:space="0"/>
             </w:tcBorders>
-            <w:tcW w:w="5448" w:type="dxa"/>
+            <w:tcW w:w="2976" w:type="dxa"/>
+          </w:tcPr>
+          <w:p>
+            <w:pPr>
+              <w:pStyle w:val="989"/>
+              <w:spacing w:after="160" w:before="0"/>
+              <w:ind/>
+              <w:rPr>
+                <w:sz w:val="22"/>
+              </w:rPr>
+            </w:pPr>
+            <w:r>
+              <w:rPr>
+                <w:sz w:val="22"/>
+              </w:rPr>
+              <w:t xml:space="preserve">R0 harus berpasangan dengan K5</w:t>
+            </w:r>
+            <w:r>
+              <w:rPr>
+                <w:sz w:val="22"/>
+              </w:rPr>
+            </w:r>
+            <w:r>
+              <w:rPr>
+                <w:sz w:val="22"/>
+              </w:rPr>
+            </w:r>
+          </w:p>
+        </w:tc>
+        <w:tc>
+          <w:tcPr>
+            <w:tcBorders>
+              <w:top w:val="single" w:color="000000" w:sz="4" w:space="0"/>
+              <w:left w:val="single" w:color="000000" w:sz="4" w:space="0"/>
+              <w:bottom w:val="single" w:color="000000" w:sz="4" w:space="0"/>
+              <w:right w:val="single" w:color="000000" w:sz="4" w:space="0"/>
+            </w:tcBorders>
+            <w:tcW w:w="5873" w:type="dxa"/>
           </w:tcPr>
           <w:p>
             <w:pPr>
@@ -17829,31 +17988,28 @@
               <w:bottom w:val="single" w:color="000000" w:sz="4" w:space="0"/>
               <w:right w:val="single" w:color="000000" w:sz="4" w:space="0"/>
             </w:tcBorders>
-            <w:tcW w:w="3912" w:type="dxa"/>
+            <w:tcW w:w="511" w:type="dxa"/>
           </w:tcPr>
           <w:p>
             <w:pPr>
-              <w:pStyle w:val="989"/>
-              <w:spacing w:after="160" w:before="0"/>
+              <w:spacing/>
               <w:ind/>
               <w:rPr>
                 <w:sz w:val="22"/>
+                <w:szCs w:val="22"/>
               </w:rPr>
             </w:pPr>
             <w:r>
               <w:rPr>
                 <w:sz w:val="22"/>
-              </w:rPr>
-              <w:t xml:space="preserve">R1 tidak berpasangan dengan K3</w:t>
-            </w:r>
-            <w:r>
-              <w:rPr>
-                <w:sz w:val="22"/>
-              </w:rPr>
-            </w:r>
-            <w:r>
-              <w:rPr>
-                <w:sz w:val="22"/>
+                <w:szCs w:val="22"/>
+              </w:rPr>
+              <w:t xml:space="preserve">2</w:t>
+            </w:r>
+            <w:r>
+              <w:rPr>
+                <w:sz w:val="22"/>
+                <w:szCs w:val="22"/>
               </w:rPr>
             </w:r>
           </w:p>
@@ -17866,7 +18022,44 @@
               <w:bottom w:val="single" w:color="000000" w:sz="4" w:space="0"/>
               <w:right w:val="single" w:color="000000" w:sz="4" w:space="0"/>
             </w:tcBorders>
-            <w:tcW w:w="5448" w:type="dxa"/>
+            <w:tcW w:w="2976" w:type="dxa"/>
+          </w:tcPr>
+          <w:p>
+            <w:pPr>
+              <w:pStyle w:val="989"/>
+              <w:spacing w:after="160" w:before="0"/>
+              <w:ind/>
+              <w:rPr>
+                <w:sz w:val="22"/>
+              </w:rPr>
+            </w:pPr>
+            <w:r>
+              <w:rPr>
+                <w:sz w:val="22"/>
+              </w:rPr>
+              <w:t xml:space="preserve">R1 tidak berpasangan dengan K3</w:t>
+            </w:r>
+            <w:r>
+              <w:rPr>
+                <w:sz w:val="22"/>
+              </w:rPr>
+            </w:r>
+            <w:r>
+              <w:rPr>
+                <w:sz w:val="22"/>
+              </w:rPr>
+            </w:r>
+          </w:p>
+        </w:tc>
+        <w:tc>
+          <w:tcPr>
+            <w:tcBorders>
+              <w:top w:val="single" w:color="000000" w:sz="4" w:space="0"/>
+              <w:left w:val="single" w:color="000000" w:sz="4" w:space="0"/>
+              <w:bottom w:val="single" w:color="000000" w:sz="4" w:space="0"/>
+              <w:right w:val="single" w:color="000000" w:sz="4" w:space="0"/>
+            </w:tcBorders>
+            <w:tcW w:w="5873" w:type="dxa"/>
           </w:tcPr>
           <w:p>
             <w:pPr>
@@ -17906,31 +18099,28 @@
               <w:bottom w:val="single" w:color="000000" w:sz="4" w:space="0"/>
               <w:right w:val="single" w:color="000000" w:sz="4" w:space="0"/>
             </w:tcBorders>
-            <w:tcW w:w="3912" w:type="dxa"/>
+            <w:tcW w:w="511" w:type="dxa"/>
           </w:tcPr>
           <w:p>
             <w:pPr>
-              <w:pStyle w:val="989"/>
-              <w:spacing w:after="160" w:before="0"/>
+              <w:spacing/>
               <w:ind/>
               <w:rPr>
                 <w:sz w:val="22"/>
+                <w:szCs w:val="22"/>
               </w:rPr>
             </w:pPr>
             <w:r>
               <w:rPr>
                 <w:sz w:val="22"/>
-              </w:rPr>
-              <w:t xml:space="preserve">R2 hanya berpasangan dengan K1, K2, K3, atau K4</w:t>
-            </w:r>
-            <w:r>
-              <w:rPr>
-                <w:sz w:val="22"/>
-              </w:rPr>
-            </w:r>
-            <w:r>
-              <w:rPr>
-                <w:sz w:val="22"/>
+                <w:szCs w:val="22"/>
+              </w:rPr>
+              <w:t xml:space="preserve">3</w:t>
+            </w:r>
+            <w:r>
+              <w:rPr>
+                <w:sz w:val="22"/>
+                <w:szCs w:val="22"/>
               </w:rPr>
             </w:r>
           </w:p>
@@ -17943,7 +18133,44 @@
               <w:bottom w:val="single" w:color="000000" w:sz="4" w:space="0"/>
               <w:right w:val="single" w:color="000000" w:sz="4" w:space="0"/>
             </w:tcBorders>
-            <w:tcW w:w="5448" w:type="dxa"/>
+            <w:tcW w:w="2976" w:type="dxa"/>
+          </w:tcPr>
+          <w:p>
+            <w:pPr>
+              <w:pStyle w:val="989"/>
+              <w:spacing w:after="160" w:before="0"/>
+              <w:ind/>
+              <w:rPr>
+                <w:sz w:val="22"/>
+              </w:rPr>
+            </w:pPr>
+            <w:r>
+              <w:rPr>
+                <w:sz w:val="22"/>
+              </w:rPr>
+              <w:t xml:space="preserve">R2 hanya berpasangan dengan K1, K2, K3, atau K4</w:t>
+            </w:r>
+            <w:r>
+              <w:rPr>
+                <w:sz w:val="22"/>
+              </w:rPr>
+            </w:r>
+            <w:r>
+              <w:rPr>
+                <w:sz w:val="22"/>
+              </w:rPr>
+            </w:r>
+          </w:p>
+        </w:tc>
+        <w:tc>
+          <w:tcPr>
+            <w:tcBorders>
+              <w:top w:val="single" w:color="000000" w:sz="4" w:space="0"/>
+              <w:left w:val="single" w:color="000000" w:sz="4" w:space="0"/>
+              <w:bottom w:val="single" w:color="000000" w:sz="4" w:space="0"/>
+              <w:right w:val="single" w:color="000000" w:sz="4" w:space="0"/>
+            </w:tcBorders>
+            <w:tcW w:w="5873" w:type="dxa"/>
           </w:tcPr>
           <w:p>
             <w:pPr>
@@ -17982,31 +18209,28 @@
               <w:bottom w:val="single" w:color="000000" w:sz="4" w:space="0"/>
               <w:right w:val="single" w:color="000000" w:sz="4" w:space="0"/>
             </w:tcBorders>
-            <w:tcW w:w="3912" w:type="dxa"/>
+            <w:tcW w:w="511" w:type="dxa"/>
           </w:tcPr>
           <w:p>
             <w:pPr>
-              <w:pStyle w:val="989"/>
-              <w:spacing w:after="160" w:before="0"/>
+              <w:spacing/>
               <w:ind/>
               <w:rPr>
                 <w:sz w:val="22"/>
+                <w:szCs w:val="22"/>
               </w:rPr>
             </w:pPr>
             <w:r>
               <w:rPr>
                 <w:sz w:val="22"/>
-              </w:rPr>
-              <w:t xml:space="preserve">R2 tidak berpasangan dengan S6, S7, atau S8</w:t>
-            </w:r>
-            <w:r>
-              <w:rPr>
-                <w:sz w:val="22"/>
-              </w:rPr>
-            </w:r>
-            <w:r>
-              <w:rPr>
-                <w:sz w:val="22"/>
+                <w:szCs w:val="22"/>
+              </w:rPr>
+              <w:t xml:space="preserve">4</w:t>
+            </w:r>
+            <w:r>
+              <w:rPr>
+                <w:sz w:val="22"/>
+                <w:szCs w:val="22"/>
               </w:rPr>
             </w:r>
           </w:p>
@@ -18018,7 +18242,43 @@
               <w:bottom w:val="single" w:color="000000" w:sz="4" w:space="0"/>
               <w:right w:val="single" w:color="000000" w:sz="4" w:space="0"/>
             </w:tcBorders>
-            <w:tcW w:w="5448" w:type="dxa"/>
+            <w:tcW w:w="2976" w:type="dxa"/>
+          </w:tcPr>
+          <w:p>
+            <w:pPr>
+              <w:pStyle w:val="989"/>
+              <w:spacing w:after="160" w:before="0"/>
+              <w:ind/>
+              <w:rPr>
+                <w:sz w:val="22"/>
+              </w:rPr>
+            </w:pPr>
+            <w:r>
+              <w:rPr>
+                <w:sz w:val="22"/>
+              </w:rPr>
+              <w:t xml:space="preserve">R2 tidak berpasangan dengan S6, S7, atau S8</w:t>
+            </w:r>
+            <w:r>
+              <w:rPr>
+                <w:sz w:val="22"/>
+              </w:rPr>
+            </w:r>
+            <w:r>
+              <w:rPr>
+                <w:sz w:val="22"/>
+              </w:rPr>
+            </w:r>
+          </w:p>
+        </w:tc>
+        <w:tc>
+          <w:tcPr>
+            <w:tcBorders>
+              <w:left w:val="single" w:color="000000" w:sz="4" w:space="0"/>
+              <w:bottom w:val="single" w:color="000000" w:sz="4" w:space="0"/>
+              <w:right w:val="single" w:color="000000" w:sz="4" w:space="0"/>
+            </w:tcBorders>
+            <w:tcW w:w="5873" w:type="dxa"/>
           </w:tcPr>
           <w:p>
             <w:pPr>
@@ -18057,31 +18317,28 @@
               <w:bottom w:val="single" w:color="000000" w:sz="4" w:space="0"/>
               <w:right w:val="single" w:color="000000" w:sz="4" w:space="0"/>
             </w:tcBorders>
-            <w:tcW w:w="3912" w:type="dxa"/>
+            <w:tcW w:w="511" w:type="dxa"/>
           </w:tcPr>
           <w:p>
             <w:pPr>
-              <w:pStyle w:val="989"/>
-              <w:spacing w:after="160" w:before="0"/>
+              <w:spacing/>
               <w:ind/>
               <w:rPr>
                 <w:sz w:val="22"/>
+                <w:szCs w:val="22"/>
               </w:rPr>
             </w:pPr>
             <w:r>
               <w:rPr>
                 <w:sz w:val="22"/>
-              </w:rPr>
-              <w:t xml:space="preserve">T02 atau P8 tidak berpasangan dengan R2</w:t>
-            </w:r>
-            <w:r>
-              <w:rPr>
-                <w:sz w:val="22"/>
-              </w:rPr>
-            </w:r>
-            <w:r>
-              <w:rPr>
-                <w:sz w:val="22"/>
+                <w:szCs w:val="22"/>
+              </w:rPr>
+              <w:t xml:space="preserve">5</w:t>
+            </w:r>
+            <w:r>
+              <w:rPr>
+                <w:sz w:val="22"/>
+                <w:szCs w:val="22"/>
               </w:rPr>
             </w:r>
           </w:p>
@@ -18093,7 +18350,43 @@
               <w:bottom w:val="single" w:color="000000" w:sz="4" w:space="0"/>
               <w:right w:val="single" w:color="000000" w:sz="4" w:space="0"/>
             </w:tcBorders>
-            <w:tcW w:w="5448" w:type="dxa"/>
+            <w:tcW w:w="2976" w:type="dxa"/>
+          </w:tcPr>
+          <w:p>
+            <w:pPr>
+              <w:pStyle w:val="989"/>
+              <w:spacing w:after="160" w:before="0"/>
+              <w:ind/>
+              <w:rPr>
+                <w:sz w:val="22"/>
+              </w:rPr>
+            </w:pPr>
+            <w:r>
+              <w:rPr>
+                <w:sz w:val="22"/>
+              </w:rPr>
+              <w:t xml:space="preserve">T02 atau P8 tidak berpasangan dengan R2</w:t>
+            </w:r>
+            <w:r>
+              <w:rPr>
+                <w:sz w:val="22"/>
+              </w:rPr>
+            </w:r>
+            <w:r>
+              <w:rPr>
+                <w:sz w:val="22"/>
+              </w:rPr>
+            </w:r>
+          </w:p>
+        </w:tc>
+        <w:tc>
+          <w:tcPr>
+            <w:tcBorders>
+              <w:left w:val="single" w:color="000000" w:sz="4" w:space="0"/>
+              <w:bottom w:val="single" w:color="000000" w:sz="4" w:space="0"/>
+              <w:right w:val="single" w:color="000000" w:sz="4" w:space="0"/>
+            </w:tcBorders>
+            <w:tcW w:w="5873" w:type="dxa"/>
           </w:tcPr>
           <w:p>
             <w:pPr>
@@ -18133,31 +18426,28 @@
               <w:bottom w:val="single" w:color="000000" w:sz="4" w:space="0"/>
               <w:right w:val="single" w:color="000000" w:sz="4" w:space="0"/>
             </w:tcBorders>
-            <w:tcW w:w="3912" w:type="dxa"/>
+            <w:tcW w:w="511" w:type="dxa"/>
           </w:tcPr>
           <w:p>
             <w:pPr>
-              <w:pStyle w:val="989"/>
-              <w:spacing w:after="160" w:before="0"/>
+              <w:spacing/>
               <w:ind/>
               <w:rPr>
                 <w:sz w:val="22"/>
+                <w:szCs w:val="22"/>
               </w:rPr>
             </w:pPr>
             <w:r>
               <w:rPr>
                 <w:sz w:val="22"/>
-              </w:rPr>
-              <w:t xml:space="preserve">T01 biasanya berpasangan dengan P6</w:t>
-            </w:r>
-            <w:r>
-              <w:rPr>
-                <w:sz w:val="22"/>
-              </w:rPr>
-            </w:r>
-            <w:r>
-              <w:rPr>
-                <w:sz w:val="22"/>
+                <w:szCs w:val="22"/>
+              </w:rPr>
+              <w:t xml:space="preserve">6</w:t>
+            </w:r>
+            <w:r>
+              <w:rPr>
+                <w:sz w:val="22"/>
+                <w:szCs w:val="22"/>
               </w:rPr>
             </w:r>
           </w:p>
@@ -18170,7 +18460,44 @@
               <w:bottom w:val="single" w:color="000000" w:sz="4" w:space="0"/>
               <w:right w:val="single" w:color="000000" w:sz="4" w:space="0"/>
             </w:tcBorders>
-            <w:tcW w:w="5448" w:type="dxa"/>
+            <w:tcW w:w="2976" w:type="dxa"/>
+          </w:tcPr>
+          <w:p>
+            <w:pPr>
+              <w:pStyle w:val="989"/>
+              <w:spacing w:after="160" w:before="0"/>
+              <w:ind/>
+              <w:rPr>
+                <w:sz w:val="22"/>
+              </w:rPr>
+            </w:pPr>
+            <w:r>
+              <w:rPr>
+                <w:sz w:val="22"/>
+              </w:rPr>
+              <w:t xml:space="preserve">T01 biasanya berpasangan dengan P6</w:t>
+            </w:r>
+            <w:r>
+              <w:rPr>
+                <w:sz w:val="22"/>
+              </w:rPr>
+            </w:r>
+            <w:r>
+              <w:rPr>
+                <w:sz w:val="22"/>
+              </w:rPr>
+            </w:r>
+          </w:p>
+        </w:tc>
+        <w:tc>
+          <w:tcPr>
+            <w:tcBorders>
+              <w:top w:val="single" w:color="000000" w:sz="4" w:space="0"/>
+              <w:left w:val="single" w:color="000000" w:sz="4" w:space="0"/>
+              <w:bottom w:val="single" w:color="000000" w:sz="4" w:space="0"/>
+              <w:right w:val="single" w:color="000000" w:sz="4" w:space="0"/>
+            </w:tcBorders>
+            <w:tcW w:w="5873" w:type="dxa"/>
           </w:tcPr>
           <w:p>
             <w:pPr>
@@ -18210,31 +18537,28 @@
               <w:bottom w:val="single" w:color="000000" w:sz="4" w:space="0"/>
               <w:right w:val="single" w:color="000000" w:sz="4" w:space="0"/>
             </w:tcBorders>
-            <w:tcW w:w="3912" w:type="dxa"/>
+            <w:tcW w:w="511" w:type="dxa"/>
           </w:tcPr>
           <w:p>
             <w:pPr>
-              <w:pStyle w:val="989"/>
-              <w:spacing w:after="160" w:before="0"/>
+              <w:spacing/>
               <w:ind/>
               <w:rPr>
                 <w:sz w:val="22"/>
+                <w:szCs w:val="22"/>
               </w:rPr>
             </w:pPr>
             <w:r>
               <w:rPr>
                 <w:sz w:val="22"/>
-              </w:rPr>
-              <w:t xml:space="preserve">P1 biasanya berpasangan dengan K4</w:t>
-            </w:r>
-            <w:r>
-              <w:rPr>
-                <w:sz w:val="22"/>
-              </w:rPr>
-            </w:r>
-            <w:r>
-              <w:rPr>
-                <w:sz w:val="22"/>
+                <w:szCs w:val="22"/>
+              </w:rPr>
+              <w:t xml:space="preserve">7</w:t>
+            </w:r>
+            <w:r>
+              <w:rPr>
+                <w:sz w:val="22"/>
+                <w:szCs w:val="22"/>
               </w:rPr>
             </w:r>
           </w:p>
@@ -18247,7 +18571,44 @@
               <w:bottom w:val="single" w:color="000000" w:sz="4" w:space="0"/>
               <w:right w:val="single" w:color="000000" w:sz="4" w:space="0"/>
             </w:tcBorders>
-            <w:tcW w:w="5448" w:type="dxa"/>
+            <w:tcW w:w="2976" w:type="dxa"/>
+          </w:tcPr>
+          <w:p>
+            <w:pPr>
+              <w:pStyle w:val="989"/>
+              <w:spacing w:after="160" w:before="0"/>
+              <w:ind/>
+              <w:rPr>
+                <w:sz w:val="22"/>
+              </w:rPr>
+            </w:pPr>
+            <w:r>
+              <w:rPr>
+                <w:sz w:val="22"/>
+              </w:rPr>
+              <w:t xml:space="preserve">P1 biasanya berpasangan dengan K4</w:t>
+            </w:r>
+            <w:r>
+              <w:rPr>
+                <w:sz w:val="22"/>
+              </w:rPr>
+            </w:r>
+            <w:r>
+              <w:rPr>
+                <w:sz w:val="22"/>
+              </w:rPr>
+            </w:r>
+          </w:p>
+        </w:tc>
+        <w:tc>
+          <w:tcPr>
+            <w:tcBorders>
+              <w:top w:val="single" w:color="000000" w:sz="4" w:space="0"/>
+              <w:left w:val="single" w:color="000000" w:sz="4" w:space="0"/>
+              <w:bottom w:val="single" w:color="000000" w:sz="4" w:space="0"/>
+              <w:right w:val="single" w:color="000000" w:sz="4" w:space="0"/>
+            </w:tcBorders>
+            <w:tcW w:w="5873" w:type="dxa"/>
           </w:tcPr>
           <w:p>
             <w:pPr>
@@ -18287,31 +18648,28 @@
               <w:bottom w:val="single" w:color="000000" w:sz="4" w:space="0"/>
               <w:right w:val="single" w:color="000000" w:sz="4" w:space="0"/>
             </w:tcBorders>
-            <w:tcW w:w="3912" w:type="dxa"/>
+            <w:tcW w:w="511" w:type="dxa"/>
           </w:tcPr>
           <w:p>
             <w:pPr>
-              <w:pStyle w:val="989"/>
-              <w:spacing w:after="160" w:before="0"/>
+              <w:spacing/>
               <w:ind/>
               <w:rPr>
                 <w:sz w:val="22"/>
+                <w:szCs w:val="22"/>
               </w:rPr>
             </w:pPr>
             <w:r>
               <w:rPr>
                 <w:sz w:val="22"/>
-              </w:rPr>
-              <w:t xml:space="preserve">Tanpa subjek eksplisit, V4 = S9</w:t>
-            </w:r>
-            <w:r>
-              <w:rPr>
-                <w:sz w:val="22"/>
-              </w:rPr>
-            </w:r>
-            <w:r>
-              <w:rPr>
-                <w:sz w:val="22"/>
+                <w:szCs w:val="22"/>
+              </w:rPr>
+              <w:t xml:space="preserve">8</w:t>
+            </w:r>
+            <w:r>
+              <w:rPr>
+                <w:sz w:val="22"/>
+                <w:szCs w:val="22"/>
               </w:rPr>
             </w:r>
           </w:p>
@@ -18324,7 +18682,44 @@
               <w:bottom w:val="single" w:color="000000" w:sz="4" w:space="0"/>
               <w:right w:val="single" w:color="000000" w:sz="4" w:space="0"/>
             </w:tcBorders>
-            <w:tcW w:w="5448" w:type="dxa"/>
+            <w:tcW w:w="2976" w:type="dxa"/>
+          </w:tcPr>
+          <w:p>
+            <w:pPr>
+              <w:pStyle w:val="989"/>
+              <w:spacing w:after="160" w:before="0"/>
+              <w:ind/>
+              <w:rPr>
+                <w:sz w:val="22"/>
+              </w:rPr>
+            </w:pPr>
+            <w:r>
+              <w:rPr>
+                <w:sz w:val="22"/>
+              </w:rPr>
+              <w:t xml:space="preserve">Tanpa subjek eksplisit, V4 = S9</w:t>
+            </w:r>
+            <w:r>
+              <w:rPr>
+                <w:sz w:val="22"/>
+              </w:rPr>
+            </w:r>
+            <w:r>
+              <w:rPr>
+                <w:sz w:val="22"/>
+              </w:rPr>
+            </w:r>
+          </w:p>
+        </w:tc>
+        <w:tc>
+          <w:tcPr>
+            <w:tcBorders>
+              <w:top w:val="single" w:color="000000" w:sz="4" w:space="0"/>
+              <w:left w:val="single" w:color="000000" w:sz="4" w:space="0"/>
+              <w:bottom w:val="single" w:color="000000" w:sz="4" w:space="0"/>
+              <w:right w:val="single" w:color="000000" w:sz="4" w:space="0"/>
+            </w:tcBorders>
+            <w:tcW w:w="5873" w:type="dxa"/>
           </w:tcPr>
           <w:p>
             <w:pPr>
@@ -18494,19 +18889,6 @@
       <w:r>
         <w:t xml:space="preserve"> satu baris adalah satu kalimat. Nomor kalimat tidak selalu berurutan (misalnya Kalimat 3 langsung ke Kalimat 13) karena hanya kalimat terpilih yang tersedia. Baca konteks hanya dari baris yang ada.</w:t>
       </w:r>
-      <w:r/>
-    </w:p>
-    <w:p>
-      <w:pPr>
-        <w:shd w:val="nil" w:color="ffffff"/>
-        <w:spacing/>
-        <w:ind/>
-        <w:rPr/>
-      </w:pPr>
-      <w:r>
-        <w:br w:type="page" w:clear="all"/>
-      </w:r>
-      <w:r/>
       <w:r/>
     </w:p>
     <w:p>
@@ -18549,7 +18931,7 @@
         <w:t xml:space="preserve">coding</w:t>
       </w:r>
       <w:r>
-        <w:t xml:space="preserve"> beserta alasannya. Kolom “Kode” berisi nilai V5 / V6 / V7 / V4 / V8 / V9 pada lembar </w:t>
+        <w:t xml:space="preserve"> beserta alasannya. Kolom “Kode” berisi nilai V4 / V5 / V6 / V7 / V8 / V9 pada lembar </w:t>
       </w:r>
       <w:r>
         <w:rPr>
@@ -18579,8 +18961,8 @@
       </w:tblPr>
       <w:tblGrid>
         <w:gridCol w:w="4196"/>
-        <w:gridCol w:w="1559"/>
-        <w:gridCol w:w="3605"/>
+        <w:gridCol w:w="1275"/>
+        <w:gridCol w:w="3889"/>
       </w:tblGrid>
       <w:tr>
         <w:trPr>
@@ -18633,7 +19015,7 @@
               <w:bottom w:val="single" w:color="000000" w:sz="4" w:space="0"/>
               <w:right w:val="single" w:color="000000" w:sz="4" w:space="0"/>
             </w:tcBorders>
-            <w:tcW w:w="1559" w:type="dxa"/>
+            <w:tcW w:w="1275" w:type="dxa"/>
           </w:tcPr>
           <w:p>
             <w:pPr>
@@ -18671,7 +19053,7 @@
               <w:bottom w:val="single" w:color="000000" w:sz="4" w:space="0"/>
               <w:right w:val="single" w:color="000000" w:sz="4" w:space="0"/>
             </w:tcBorders>
-            <w:tcW w:w="3605" w:type="dxa"/>
+            <w:tcW w:w="3889" w:type="dxa"/>
           </w:tcPr>
           <w:p>
             <w:pPr>
@@ -18748,7 +19130,7 @@
               <w:bottom w:val="single" w:color="000000" w:sz="4" w:space="0"/>
               <w:right w:val="single" w:color="000000" w:sz="4" w:space="0"/>
             </w:tcBorders>
-            <w:tcW w:w="1559" w:type="dxa"/>
+            <w:tcW w:w="1275" w:type="dxa"/>
           </w:tcPr>
           <w:p>
             <w:pPr>
@@ -18763,7 +19145,19 @@
               <w:rPr>
                 <w:sz w:val="22"/>
               </w:rPr>
-              <w:t xml:space="preserve">R1 / T02 / P8 / S9 / F8 / K5</w:t>
+            </w:r>
+            <w:r>
+              <w:rPr>
+                <w:sz w:val="22"/>
+              </w:rPr>
+              <w:t xml:space="preserve">S9 / </w:t>
+            </w:r>
+            <w:r/>
+            <w:r>
+              <w:rPr>
+                <w:sz w:val="22"/>
+              </w:rPr>
+              <w:t xml:space="preserve">R1 / T02 / P8 / F8 / K5</w:t>
             </w:r>
             <w:r>
               <w:rPr>
@@ -18785,7 +19179,7 @@
               <w:bottom w:val="single" w:color="000000" w:sz="4" w:space="0"/>
               <w:right w:val="single" w:color="000000" w:sz="4" w:space="0"/>
             </w:tcBorders>
-            <w:tcW w:w="3605" w:type="dxa"/>
+            <w:tcW w:w="3889" w:type="dxa"/>
           </w:tcPr>
           <w:p>
             <w:pPr>
@@ -18860,7 +19254,7 @@
               <w:bottom w:val="single" w:color="000000" w:sz="4" w:space="0"/>
               <w:right w:val="single" w:color="000000" w:sz="4" w:space="0"/>
             </w:tcBorders>
-            <w:tcW w:w="1559" w:type="dxa"/>
+            <w:tcW w:w="1275" w:type="dxa"/>
           </w:tcPr>
           <w:p>
             <w:pPr>
@@ -18875,7 +19269,19 @@
               <w:rPr>
                 <w:sz w:val="22"/>
               </w:rPr>
-              <w:t xml:space="preserve">R0 / T02 / P8 / S9 / F8 / K5</w:t>
+            </w:r>
+            <w:r>
+              <w:rPr>
+                <w:sz w:val="22"/>
+              </w:rPr>
+              <w:t xml:space="preserve">S9 / </w:t>
+            </w:r>
+            <w:r/>
+            <w:r>
+              <w:rPr>
+                <w:sz w:val="22"/>
+              </w:rPr>
+              <w:t xml:space="preserve">R0 / T02 / P8 / F8 / K5</w:t>
             </w:r>
             <w:r>
               <w:rPr>
@@ -18896,7 +19302,7 @@
               <w:bottom w:val="single" w:color="000000" w:sz="4" w:space="0"/>
               <w:right w:val="single" w:color="000000" w:sz="4" w:space="0"/>
             </w:tcBorders>
-            <w:tcW w:w="3605" w:type="dxa"/>
+            <w:tcW w:w="3889" w:type="dxa"/>
           </w:tcPr>
           <w:p>
             <w:pPr>
@@ -18971,7 +19377,7 @@
               <w:bottom w:val="single" w:color="000000" w:sz="4" w:space="0"/>
               <w:right w:val="single" w:color="000000" w:sz="4" w:space="0"/>
             </w:tcBorders>
-            <w:tcW w:w="1559" w:type="dxa"/>
+            <w:tcW w:w="1275" w:type="dxa"/>
           </w:tcPr>
           <w:p>
             <w:pPr>
@@ -18986,7 +19392,19 @@
               <w:rPr>
                 <w:sz w:val="22"/>
               </w:rPr>
-              <w:t xml:space="preserve">R1 / T11 / P2 / S8 / F8 / K1</w:t>
+            </w:r>
+            <w:r>
+              <w:rPr>
+                <w:sz w:val="22"/>
+              </w:rPr>
+              <w:t xml:space="preserve">S8 / </w:t>
+            </w:r>
+            <w:r/>
+            <w:r>
+              <w:rPr>
+                <w:sz w:val="22"/>
+              </w:rPr>
+              <w:t xml:space="preserve">R1 / T11 / P2 / F8 / K1</w:t>
             </w:r>
             <w:r>
               <w:rPr>
@@ -19007,7 +19425,7 @@
               <w:bottom w:val="single" w:color="000000" w:sz="4" w:space="0"/>
               <w:right w:val="single" w:color="000000" w:sz="4" w:space="0"/>
             </w:tcBorders>
-            <w:tcW w:w="3605" w:type="dxa"/>
+            <w:tcW w:w="3889" w:type="dxa"/>
           </w:tcPr>
           <w:p>
             <w:pPr>
@@ -19082,7 +19500,7 @@
               <w:bottom w:val="single" w:color="000000" w:sz="4" w:space="0"/>
               <w:right w:val="single" w:color="000000" w:sz="4" w:space="0"/>
             </w:tcBorders>
-            <w:tcW w:w="1559" w:type="dxa"/>
+            <w:tcW w:w="1275" w:type="dxa"/>
           </w:tcPr>
           <w:p>
             <w:pPr>
@@ -19097,7 +19515,19 @@
               <w:rPr>
                 <w:sz w:val="22"/>
               </w:rPr>
-              <w:t xml:space="preserve">R1 / T01 / P6 / S9 / F8 / K4</w:t>
+            </w:r>
+            <w:r>
+              <w:rPr>
+                <w:sz w:val="22"/>
+              </w:rPr>
+              <w:t xml:space="preserve">S9 / </w:t>
+            </w:r>
+            <w:r/>
+            <w:r>
+              <w:rPr>
+                <w:sz w:val="22"/>
+              </w:rPr>
+              <w:t xml:space="preserve">R1 / T01 / P6 / F8 / K4</w:t>
             </w:r>
             <w:r>
               <w:rPr>
@@ -19118,7 +19548,7 @@
               <w:bottom w:val="single" w:color="000000" w:sz="4" w:space="0"/>
               <w:right w:val="single" w:color="000000" w:sz="4" w:space="0"/>
             </w:tcBorders>
-            <w:tcW w:w="3605" w:type="dxa"/>
+            <w:tcW w:w="3889" w:type="dxa"/>
           </w:tcPr>
           <w:p>
             <w:pPr>
@@ -19193,7 +19623,7 @@
               <w:bottom w:val="single" w:color="000000" w:sz="4" w:space="0"/>
               <w:right w:val="single" w:color="000000" w:sz="4" w:space="0"/>
             </w:tcBorders>
-            <w:tcW w:w="1559" w:type="dxa"/>
+            <w:tcW w:w="1275" w:type="dxa"/>
           </w:tcPr>
           <w:p>
             <w:pPr>
@@ -19208,7 +19638,19 @@
               <w:rPr>
                 <w:sz w:val="22"/>
               </w:rPr>
-              <w:t xml:space="preserve">R2 / T07 / P3 / S4 / F7 / K3</w:t>
+            </w:r>
+            <w:r>
+              <w:rPr>
+                <w:sz w:val="22"/>
+              </w:rPr>
+              <w:t xml:space="preserve">S4 / </w:t>
+            </w:r>
+            <w:r/>
+            <w:r>
+              <w:rPr>
+                <w:sz w:val="22"/>
+              </w:rPr>
+              <w:t xml:space="preserve">R2 / T07 / P3 / F7 / K3</w:t>
             </w:r>
             <w:r>
               <w:rPr>
@@ -19229,7 +19671,7 @@
               <w:bottom w:val="single" w:color="000000" w:sz="4" w:space="0"/>
               <w:right w:val="single" w:color="000000" w:sz="4" w:space="0"/>
             </w:tcBorders>
-            <w:tcW w:w="3605" w:type="dxa"/>
+            <w:tcW w:w="3889" w:type="dxa"/>
           </w:tcPr>
           <w:p>
             <w:pPr>
@@ -19306,7 +19748,7 @@
               <w:bottom w:val="single" w:color="000000" w:sz="4" w:space="0"/>
               <w:right w:val="single" w:color="000000" w:sz="4" w:space="0"/>
             </w:tcBorders>
-            <w:tcW w:w="1559" w:type="dxa"/>
+            <w:tcW w:w="1275" w:type="dxa"/>
           </w:tcPr>
           <w:p>
             <w:pPr>
@@ -19321,7 +19763,19 @@
               <w:rPr>
                 <w:sz w:val="22"/>
               </w:rPr>
-              <w:t xml:space="preserve">R2 / T09 / P2 / S9 / F1 / K3</w:t>
+            </w:r>
+            <w:r>
+              <w:rPr>
+                <w:sz w:val="22"/>
+              </w:rPr>
+              <w:t xml:space="preserve">S9 / </w:t>
+            </w:r>
+            <w:r/>
+            <w:r>
+              <w:rPr>
+                <w:sz w:val="22"/>
+              </w:rPr>
+              <w:t xml:space="preserve">R2 / T09 / P2 / F1 / K3</w:t>
             </w:r>
             <w:r>
               <w:rPr>
@@ -19343,7 +19797,7 @@
               <w:bottom w:val="single" w:color="000000" w:sz="4" w:space="0"/>
               <w:right w:val="single" w:color="000000" w:sz="4" w:space="0"/>
             </w:tcBorders>
-            <w:tcW w:w="3605" w:type="dxa"/>
+            <w:tcW w:w="3889" w:type="dxa"/>
           </w:tcPr>
           <w:p>
             <w:pPr>
@@ -19421,7 +19875,7 @@
               <w:bottom w:val="single" w:color="000000" w:sz="4" w:space="0"/>
               <w:right w:val="single" w:color="000000" w:sz="4" w:space="0"/>
             </w:tcBorders>
-            <w:tcW w:w="1559" w:type="dxa"/>
+            <w:tcW w:w="1275" w:type="dxa"/>
             <w:vMerge w:val="restart"/>
           </w:tcPr>
           <w:p>
@@ -19437,7 +19891,19 @@
               <w:rPr>
                 <w:sz w:val="22"/>
               </w:rPr>
-              <w:t xml:space="preserve">R2 / T15 / P2 / S1 / F8 / K4</w:t>
+            </w:r>
+            <w:r>
+              <w:rPr>
+                <w:sz w:val="22"/>
+              </w:rPr>
+              <w:t xml:space="preserve">S2 / </w:t>
+            </w:r>
+            <w:r/>
+            <w:r>
+              <w:rPr>
+                <w:sz w:val="22"/>
+              </w:rPr>
+              <w:t xml:space="preserve">R2 / T15 / P2 / F8 / K4</w:t>
             </w:r>
             <w:r>
               <w:rPr>
@@ -19459,7 +19925,7 @@
               <w:bottom w:val="single" w:color="000000" w:sz="4" w:space="0"/>
               <w:right w:val="single" w:color="000000" w:sz="4" w:space="0"/>
             </w:tcBorders>
-            <w:tcW w:w="3605" w:type="dxa"/>
+            <w:tcW w:w="3889" w:type="dxa"/>
             <w:vMerge w:val="restart"/>
           </w:tcPr>
           <w:p>
@@ -19475,7 +19941,7 @@
               <w:rPr>
                 <w:sz w:val="22"/>
               </w:rPr>
-              <w:t xml:space="preserve">Prinsip “sesuai tujuan” adalah T15, bukan T16. Kewajiban untuk Pengendali (S1) yang dapat ditulis “Sistem harus memproses data sesuai tujuan”, sehingga R2. Berlaku pada seluruh siklus (F8) dan membatasi perilaku sistem tanpa menuntut fitur baru (K4).</w:t>
+              <w:t xml:space="preserve">Prinsip “sesuai tujuan” adalah T15, bukan T16. Kewajiban untuk Pengendali (S2) yang dapat ditulis “Sistem harus memproses data sesuai tujuan”, sehingga R2. Berlaku pada seluruh siklus (F8) dan membatasi perilaku sistem tanpa menuntut fitur baru (K4).</w:t>
             </w:r>
             <w:r>
               <w:rPr>
@@ -19537,7 +20003,7 @@
               <w:bottom w:val="single" w:color="000000" w:sz="4" w:space="0"/>
               <w:right w:val="single" w:color="000000" w:sz="4" w:space="0"/>
             </w:tcBorders>
-            <w:tcW w:w="1559" w:type="dxa"/>
+            <w:tcW w:w="1275" w:type="dxa"/>
           </w:tcPr>
           <w:p>
             <w:pPr>
@@ -19552,7 +20018,19 @@
               <w:rPr>
                 <w:sz w:val="22"/>
               </w:rPr>
-              <w:t xml:space="preserve">R2 / T11 / P2 / S1 / F4 / K1</w:t>
+            </w:r>
+            <w:r>
+              <w:rPr>
+                <w:sz w:val="22"/>
+              </w:rPr>
+              <w:t xml:space="preserve">S2 / </w:t>
+            </w:r>
+            <w:r/>
+            <w:r>
+              <w:rPr>
+                <w:sz w:val="22"/>
+              </w:rPr>
+              <w:t xml:space="preserve">R2 / T11 / P2 / F4 / K1</w:t>
             </w:r>
             <w:r>
               <w:rPr>
@@ -19574,7 +20052,7 @@
               <w:bottom w:val="single" w:color="000000" w:sz="4" w:space="0"/>
               <w:right w:val="single" w:color="000000" w:sz="4" w:space="0"/>
             </w:tcBorders>
-            <w:tcW w:w="3605" w:type="dxa"/>
+            <w:tcW w:w="3889" w:type="dxa"/>
           </w:tcPr>
           <w:p>
             <w:pPr>
@@ -19651,7 +20129,7 @@
               <w:bottom w:val="single" w:color="000000" w:sz="4" w:space="0"/>
               <w:right w:val="single" w:color="000000" w:sz="4" w:space="0"/>
             </w:tcBorders>
-            <w:tcW w:w="1559" w:type="dxa"/>
+            <w:tcW w:w="1275" w:type="dxa"/>
           </w:tcPr>
           <w:p>
             <w:pPr>
@@ -19666,7 +20144,19 @@
               <w:rPr>
                 <w:sz w:val="22"/>
               </w:rPr>
-              <w:t xml:space="preserve">R2 / T08 / P2 / S1 / F6 / K3</w:t>
+            </w:r>
+            <w:r>
+              <w:rPr>
+                <w:sz w:val="22"/>
+              </w:rPr>
+              <w:t xml:space="preserve">S2 / </w:t>
+            </w:r>
+            <w:r/>
+            <w:r>
+              <w:rPr>
+                <w:sz w:val="22"/>
+              </w:rPr>
+              <w:t xml:space="preserve">R2 / T08 / P2 / F6 / K3</w:t>
             </w:r>
             <w:r>
               <w:rPr>
@@ -19688,7 +20178,7 @@
               <w:bottom w:val="single" w:color="000000" w:sz="4" w:space="0"/>
               <w:right w:val="single" w:color="000000" w:sz="4" w:space="0"/>
             </w:tcBorders>
-            <w:tcW w:w="3605" w:type="dxa"/>
+            <w:tcW w:w="3889" w:type="dxa"/>
           </w:tcPr>
           <w:p>
             <w:pPr>
@@ -19765,7 +20255,7 @@
               <w:bottom w:val="single" w:color="000000" w:sz="4" w:space="0"/>
               <w:right w:val="single" w:color="000000" w:sz="4" w:space="0"/>
             </w:tcBorders>
-            <w:tcW w:w="1559" w:type="dxa"/>
+            <w:tcW w:w="1275" w:type="dxa"/>
           </w:tcPr>
           <w:p>
             <w:pPr>
@@ -19780,7 +20270,19 @@
               <w:rPr>
                 <w:sz w:val="22"/>
               </w:rPr>
-              <w:t xml:space="preserve">R2 / T03 / P1 / S5 / F2 / K4</w:t>
+            </w:r>
+            <w:r>
+              <w:rPr>
+                <w:sz w:val="22"/>
+              </w:rPr>
+              <w:t xml:space="preserve">S5 / </w:t>
+            </w:r>
+            <w:r/>
+            <w:r>
+              <w:rPr>
+                <w:sz w:val="22"/>
+              </w:rPr>
+              <w:t xml:space="preserve">R2 / T03 / P1 / F2 / K4</w:t>
             </w:r>
             <w:r>
               <w:rPr>
@@ -19802,7 +20304,7 @@
               <w:bottom w:val="single" w:color="000000" w:sz="4" w:space="0"/>
               <w:right w:val="single" w:color="000000" w:sz="4" w:space="0"/>
             </w:tcBorders>
-            <w:tcW w:w="3605" w:type="dxa"/>
+            <w:tcW w:w="3889" w:type="dxa"/>
           </w:tcPr>
           <w:p>
             <w:pPr>
@@ -19879,7 +20381,7 @@
               <w:bottom w:val="single" w:color="000000" w:sz="4" w:space="0"/>
               <w:right w:val="single" w:color="000000" w:sz="4" w:space="0"/>
             </w:tcBorders>
-            <w:tcW w:w="1559" w:type="dxa"/>
+            <w:tcW w:w="1275" w:type="dxa"/>
           </w:tcPr>
           <w:p>
             <w:pPr>
@@ -19894,7 +20396,19 @@
               <w:rPr>
                 <w:sz w:val="22"/>
               </w:rPr>
-              <w:t xml:space="preserve">R1 / T14 / P5 / S6 / F2 / K4</w:t>
+            </w:r>
+            <w:r>
+              <w:rPr>
+                <w:sz w:val="22"/>
+              </w:rPr>
+              <w:t xml:space="preserve">S6 / </w:t>
+            </w:r>
+            <w:r/>
+            <w:r>
+              <w:rPr>
+                <w:sz w:val="22"/>
+              </w:rPr>
+              <w:t xml:space="preserve">R1 / T14 / P5 / F2 / K4</w:t>
             </w:r>
             <w:r>
               <w:rPr>
@@ -19916,7 +20430,7 @@
               <w:bottom w:val="single" w:color="000000" w:sz="4" w:space="0"/>
               <w:right w:val="single" w:color="000000" w:sz="4" w:space="0"/>
             </w:tcBorders>
-            <w:tcW w:w="3605" w:type="dxa"/>
+            <w:tcW w:w="3889" w:type="dxa"/>
           </w:tcPr>
           <w:p>
             <w:pPr>
@@ -20262,19 +20776,6 @@
       <w:r>
         <w:t xml:space="preserve"> mandiri selesai.</w:t>
       </w:r>
-      <w:r/>
-    </w:p>
-    <w:p>
-      <w:pPr>
-        <w:shd w:val="nil" w:color="ffffff"/>
-        <w:spacing/>
-        <w:ind/>
-        <w:rPr/>
-      </w:pPr>
-      <w:r>
-        <w:br w:type="page" w:clear="all"/>
-      </w:r>
-      <w:r/>
       <w:r/>
     </w:p>
     <w:p>
@@ -20898,13 +21399,19 @@
         <w:rPr>
           <w:highlight w:val="none"/>
         </w:rPr>
-        <w:t xml:space="preserve"> Selain itu ditambahka</w:t>
+        <w:t xml:space="preserve"> Selain itu ditambahkan: pilihan Kode - Label pada V4 sampai V10, aturan “fokus utama” beserta pembeda T15 vs T11 dan T13, contoh baris 55 (T15), pembatasan kriteria R1(b), redaksi Pertanyaan C dengan diagram baru, dan baris 30 sebagai unit pilot sehingga</w:t>
       </w:r>
       <w:r>
         <w:rPr>
           <w:highlight w:val="none"/>
         </w:rPr>
-        <w:t xml:space="preserve">n: pilihan Kode - Label pada V4 sampai V10, aturan “fokus utama” beserta pembeda T15 vs T11 dan T13, contoh baris 55 (T15), pembatasan kriteria R1(b), redaksi Pertanyaan C dengan diagram baru, dan baris 30 sebagai unit pilot sehingga pilot menjadi 13 unit.</w:t>
+        <w:t xml:space="preserve"> pilot menjadi 13 unit. Kode Subjek Norma (V4) ditukar: S1 = Pengendali dan Prosesor (semula S3), S2 = Pengendali Data Pribadi (semu</w:t>
+      </w:r>
+      <w:r>
+        <w:rPr>
+          <w:highlight w:val="none"/>
+        </w:rPr>
+        <w:t xml:space="preserve">la S1), dan S3 = Prosesor Data Pribadi (semula S2); lembar coding dan file kunci adjudikasi harus memakai kode V4 yang baru. Aturan pemilihan V4 diseragamkan pada Bagian 4, 7.1, dan 8: subjek norma utama pada ayat dominan, diperiksa berurutan S1 sampai S9.</w:t>
       </w:r>
       <w:r>
         <w:rPr>

</xml_diff>